<commit_message>
Update property restriction form to use original template
Modify the property restriction form to precisely match the original Word document template by injecting placeholders for all editable fields, ensuring an exact visual reproduction with only the text content updated.

Replit-Commit-Author: Agent
Replit-Commit-Session-Id: 12181e52-eb76-427f-8200-e868f0fd7a8f
Replit-Commit-Checkpoint-Type: full_checkpoint
Replit-Commit-Event-Id: 2e01bb58-fc52-4115-9447-955b3d8c1936
Replit-Commit-Screenshot-Url: https://storage.googleapis.com/screenshot-production-us-central1/d76cc230-a508-46af-99a2-c8a4a09ee388/12181e52-eb76-427f-8200-e868f0fd7a8f/932tQfE
Replit-Helium-Checkpoint-Created: true
</commit_message>
<xml_diff>
--- a/artifacts/cdc-coach/public/property-restriction-template.docx
+++ b/artifacts/cdc-coach/public/property-restriction-template.docx
@@ -1,6 +1,2098 @@
 
-<file path=word/document.xml><?xml version="1.0" encoding="UTF-8" standalone="yes"?>
-<w:document xmlns:wpc="http://schemas.microsoft.com/office/word/2010/wordprocessingCanvas" xmlns:cx="http://schemas.microsoft.com/office/drawing/2014/chartex" xmlns:cx1="http://schemas.microsoft.com/office/drawing/2015/9/8/chartex" xmlns:cx2="http://schemas.microsoft.com/office/drawing/2015/10/21/chartex" xmlns:cx3="http://schemas.microsoft.com/office/drawing/2016/5/9/chartex" xmlns:cx4="http://schemas.microsoft.com/office/drawing/2016/5/10/chartex" xmlns:cx5="http://schemas.microsoft.com/office/drawing/2016/5/11/chartex" xmlns:cx6="http://schemas.microsoft.com/office/drawing/2016/5/12/chartex" xmlns:cx7="http://schemas.microsoft.com/office/drawing/2016/5/13/chartex" xmlns:cx8="http://schemas.microsoft.com/office/drawing/2016/5/14/chartex" xmlns:mc="http://schemas.openxmlformats.org/markup-compatibility/2006" xmlns:aink="http://schemas.microsoft.com/office/drawing/2016/ink" xmlns:am3d="http://schemas.microsoft.com/office/drawing/2017/model3d" xmlns:o="urn:schemas-microsoft-com:office:office" xmlns:oel="http://schemas.microsoft.com/office/2019/extlst" xmlns:r="http://schemas.openxmlformats.org/officeDocument/2006/relationships" xmlns:m="http://schemas.openxmlformats.org/officeDocument/2006/math" xmlns:v="urn:schemas-microsoft-com:vml" xmlns:wp14="http://schemas.microsoft.com/office/word/2010/wordprocessingDrawing" xmlns:wp="http://schemas.openxmlformats.org/drawingml/2006/wordprocessingDrawing" xmlns:w10="urn:schemas-microsoft-com:office:word" xmlns:w="http://schemas.openxmlformats.org/wordprocessingml/2006/main" xmlns:w14="http://schemas.microsoft.com/office/word/2010/wordml" xmlns:w15="http://schemas.microsoft.com/office/word/2012/wordml" xmlns:w16cex="http://schemas.microsoft.com/office/word/2018/wordml/cex" xmlns:w16cid="http://schemas.microsoft.com/office/word/2016/wordml/cid" xmlns:w16="http://schemas.microsoft.com/office/word/2018/wordml" xmlns:w16du="http://schemas.microsoft.com/office/word/2023/wordml/word16du" xmlns:w16sdtdh="http://schemas.microsoft.com/office/word/2020/wordml/sdtdatahash" xmlns:w16sdtfl="http://schemas.microsoft.com/office/word/2024/wordml/sdtformatlock" xmlns:w16se="http://schemas.microsoft.com/office/word/2015/wordml/symex" xmlns:wpg="http://schemas.microsoft.com/office/word/2010/wordprocessingGroup" xmlns:wpi="http://schemas.microsoft.com/office/word/2010/wordprocessingInk" xmlns:wne="http://schemas.microsoft.com/office/word/2006/wordml" xmlns:wps="http://schemas.microsoft.com/office/word/2010/wordprocessingShape" mc:Ignorable="w14 w15 w16se w16cid w16 w16cex w16sdtdh w16sdtfl w16du wp14"><w:body><w:p><w:pPr><w:jc w:val="center"/></w:pPr><w:r><w:t>S</w:t></w:r><w:r><w:t>tate of Florida</w:t></w:r></w:p><w:p><w:pPr><w:jc w:val="center"/></w:pPr><w:r><w:t>Department of Corrections</w:t></w:r></w:p><w:p><w:pPr><w:jc w:val="center"/></w:pPr><w:r><w:t>Okeechobee</w:t></w:r><w:r><w:t xml:space="preserve"> Correctional Institution</w:t></w:r></w:p><w:p><w:pPr><w:jc w:val="center"/><w:rPr><w:b/></w:rPr></w:pPr><w:r><w:rPr><w:b/></w:rPr><w:t>PROPERTY RESTRICTION FORM</w:t></w:r></w:p><w:p><w:pPr><w:jc w:val="center"/></w:pPr></w:p><w:tbl><w:tblPr><w:tblStyle w:val="TableGrid"/><w:tblW w:w="10260" w:type="dxa"/><w:tblInd w:w="-702" w:type="dxa"/><w:tblBorders><w:top w:val="none" w:sz="0" w:space="0" w:color="auto"/><w:left w:val="none" w:sz="0" w:space="0" w:color="auto"/><w:bottom w:val="none" w:sz="0" w:space="0" w:color="auto"/><w:right w:val="none" w:sz="0" w:space="0" w:color="auto"/><w:insideH w:val="none" w:sz="0" w:space="0" w:color="auto"/><w:insideV w:val="none" w:sz="0" w:space="0" w:color="auto"/></w:tblBorders><w:tblLook w:val="04A0" w:firstRow="1" w:lastRow="0" w:firstColumn="1" w:lastColumn="0" w:noHBand="0" w:noVBand="1"/></w:tblPr><w:tblGrid><w:gridCol w:w="1620"/><w:gridCol w:w="180"/><w:gridCol w:w="1680"/><w:gridCol w:w="750"/><w:gridCol w:w="1710"/><w:gridCol w:w="613"/><w:gridCol w:w="737"/><w:gridCol w:w="720"/><w:gridCol w:w="2250"/></w:tblGrid><w:tr><w:trPr><w:trHeight w:val="432"/></w:trPr><w:tc><w:tcPr><w:tcW w:w="1620" w:type="dxa"/><w:vAlign w:val="bottom"/></w:tcPr><w:p><w:r><w:t>Inmate Name:</w:t></w:r></w:p></w:tc><w:tc><w:tcPr><w:tcW w:w="4933" w:type="dxa"/><w:gridSpan w:val="5"/><w:tcBorders><w:bottom w:val="single" w:sz="4" w:space="0" w:color="auto"/></w:tcBorders><w:vAlign w:val="bottom"/></w:tcPr><w:p><w:pPr><w:pStyle w:val="HTMLPreformatted"/><w:rPr><w:color w:val="000000"/></w:rPr></w:pPr><w:r><w:rPr><w:color w:val="000000"/></w:rPr><w:t xml:space="preserve">{{inmateFullName}}</w:t></w:r></w:p></w:tc><w:tc><w:tcPr><w:tcW w:w="737" w:type="dxa"/><w:vAlign w:val="bottom"/></w:tcPr><w:p><w:r><w:t>DC#:</w:t></w:r></w:p></w:tc><w:tc><w:tcPr><w:tcW w:w="2970" w:type="dxa"/><w:gridSpan w:val="2"/><w:tcBorders><w:bottom w:val="single" w:sz="4" w:space="0" w:color="auto"/></w:tcBorders><w:vAlign w:val="bottom"/></w:tcPr><w:p><w:pPr><w:pStyle w:val="HTMLPreformatted"/><w:rPr><w:color w:val="000000"/></w:rPr></w:pPr><w:r><w:rPr><w:color w:val="000000"/></w:rPr><w:t xml:space="preserve">{{dcNumber}}</w:t></w:r></w:p></w:tc></w:tr><w:tr><w:trPr><w:trHeight w:val="432"/></w:trPr><w:tc><w:tcPr><w:tcW w:w="1800" w:type="dxa"/><w:gridSpan w:val="2"/><w:vAlign w:val="bottom"/></w:tcPr><w:p><w:r><w:t>Date Restricted:</w:t></w:r></w:p></w:tc><w:tc><w:tcPr><w:tcW w:w="1680" w:type="dxa"/><w:tcBorders><w:bottom w:val="single" w:sz="4" w:space="0" w:color="auto"/></w:tcBorders><w:vAlign w:val="bottom"/></w:tcPr><w:p><w:pPr><w:rPr><w:b/></w:rPr></w:pPr><w:r><w:rPr><w:b/></w:rPr><w:t xml:space="preserve">{{dateRestricted}}</w:t></w:r></w:p></w:tc><w:tc><w:tcPr><w:tcW w:w="750" w:type="dxa"/><w:vAlign w:val="bottom"/></w:tcPr><w:p><w:r><w:t>Shift:</w:t></w:r></w:p></w:tc><w:tc><w:tcPr><w:tcW w:w="1710" w:type="dxa"/><w:tcBorders><w:bottom w:val="single" w:sz="4" w:space="0" w:color="auto"/></w:tcBorders><w:vAlign w:val="bottom"/></w:tcPr><w:p><w:pPr><w:rPr><w:b/></w:rPr></w:pPr><w:r><w:rPr><w:b/></w:rPr><w:t xml:space="preserve">{{shift}}</w:t></w:r></w:p></w:tc><w:tc><w:tcPr><w:tcW w:w="2070" w:type="dxa"/><w:gridSpan w:val="3"/><w:vAlign w:val="bottom"/></w:tcPr><w:p><w:r><w:t>Dorm/Assignment:</w:t></w:r></w:p></w:tc><w:tc><w:tcPr><w:tcW w:w="2250" w:type="dxa"/><w:tcBorders><w:bottom w:val="single" w:sz="4" w:space="0" w:color="auto"/></w:tcBorders><w:vAlign w:val="bottom"/></w:tcPr><w:p><w:pPr><w:rPr><w:b/></w:rPr></w:pPr><w:r><w:rPr><w:b/></w:rPr><w:t xml:space="preserve">{{dormAssignment}}</w:t></w:r></w:p></w:tc></w:tr></w:tbl><w:p><w:pPr><w:jc w:val="center"/><w:rPr><w:b/><w:sz w:val="16"/></w:rPr></w:pPr></w:p><w:p><w:pPr><w:ind w:left="-810" w:right="-810"/><w:rPr><w:b/></w:rPr></w:pPr><w:r><w:rPr><w:b/></w:rPr><w:t>Reason for Restriction:</w:t></w:r></w:p><w:p><w:pPr><w:ind w:left="-810" w:right="-810"/><w:rPr><w:b/></w:rPr></w:pPr><w:r><w:t xml:space="preserve">{{reasonForRestriction}}</w:t></w:r></w:p><w:p><w:pPr><w:rPr><w:sz w:val="20"/></w:rPr></w:pPr></w:p><w:p><w:pPr><w:rPr><w:sz w:val="20"/></w:rPr></w:pPr></w:p><w:p><w:pPr><w:rPr><w:sz w:val="20"/></w:rPr></w:pPr></w:p><w:p/><w:pPr><w:pStyle w:val="HTMLPreformatted"/><w:rPr><w:color w:val="000000"/></w:rPr></w:pPr><w:r><w:t xml:space="preserve">{{reasonForRestriction}}</w:t></w:r></w:p><w:p><w:pPr><w:rPr><w:sz w:val="20"/></w:rPr></w:pPr></w:p><w:p><w:pPr><w:rPr><w:sz w:val="20"/></w:rPr></w:pPr></w:p><w:p><w:pPr><w:rPr><w:sz w:val="20"/></w:rPr></w:pPr></w:p><w:p/><w:p/><w:p/><w:p/><w:p/><w:p/><w:p/><w:p/><w:p/><w:p/><w:p/><w:p/><w:p/><w:p/><w:p/><w:p/><w:p/><w:p/><w:p/><w:p/><w:p/></w:txbxContent></v:textbox></v:shape></w:pict></mc:Fallback></mc:AlternateContent></w:r></w:p><w:p><w:pPr><w:ind w:left="-810" w:right="-810"/><w:rPr><w:b/></w:rPr></w:pPr></w:p><w:p><w:pPr><w:ind w:left="-810" w:right="-810"/><w:rPr><w:b/></w:rPr></w:pPr></w:p><w:p><w:pPr><w:ind w:left="-810" w:right="-810"/><w:rPr><w:b/></w:rPr></w:pPr></w:p><w:p><w:pPr><w:ind w:left="-810" w:right="-810"/><w:rPr><w:b/></w:rPr></w:pPr></w:p><w:p><w:pPr><w:ind w:left="-810" w:right="-810"/><w:rPr><w:b/><w:sz w:val="16"/></w:rPr></w:pPr></w:p><w:p><w:pPr><w:ind w:left="-810" w:right="-810"/><w:rPr><w:b/></w:rPr></w:pPr></w:p><w:p><w:pPr><w:ind w:left="-810" w:right="-810"/><w:rPr><w:b/></w:rPr></w:pPr></w:p><w:p><w:pPr><w:ind w:left="-810" w:right="-810"/><w:rPr><w:b/></w:rPr></w:pPr></w:p><w:p><w:pPr><w:ind w:left="-810" w:right="-810"/><w:rPr><w:b/></w:rPr></w:pPr></w:p><w:p><w:pPr><w:ind w:left="-810" w:right="-810"/><w:rPr><w:b/></w:rPr></w:pPr></w:p><w:p><w:pPr><w:ind w:left="-810" w:right="-810"/><w:rPr><w:b/></w:rPr></w:pPr></w:p><w:p><w:pPr><w:ind w:left="-810" w:right="-810"/><w:rPr><w:b/></w:rPr></w:pPr></w:p><w:p><w:pPr><w:ind w:left="-810" w:right="-810"/><w:rPr><w:b/></w:rPr></w:pPr><w:r><w:t xml:space="preserve">{{restrictions}}</w:t></w:r></w:p><w:tbl><w:tblPr><w:tblStyle w:val="TableGrid"/><w:tblW w:w="10260" w:type="dxa"/><w:tblInd w:w="-702" w:type="dxa"/><w:tblLook w:val="04A0" w:firstRow="1" w:lastRow="0" w:firstColumn="1" w:lastColumn="0" w:noHBand="0" w:noVBand="1"/></w:tblPr><w:tblGrid><w:gridCol w:w="5040"/><w:gridCol w:w="270"/><w:gridCol w:w="1980"/><w:gridCol w:w="540"/><w:gridCol w:w="1080"/><w:gridCol w:w="90"/><w:gridCol w:w="180"/><w:gridCol w:w="1080"/></w:tblGrid><w:tr><w:trPr><w:trHeight w:val="432"/></w:trPr><w:tc><w:tcPr><w:tcW w:w="5040" w:type="dxa"/><w:tcBorders><w:top w:val="nil"/><w:left w:val="nil"/><w:bottom w:val="single" w:sz="4" w:space="0" w:color="auto"/><w:right w:val="nil"/></w:tcBorders><w:vAlign w:val="bottom"/></w:tcPr><w:p><w:pPr><w:ind w:right="-810"/></w:pPr></w:p><w:p><w:pPr><w:ind w:right="-810"/></w:pPr></w:p><w:p><w:pPr><w:ind w:right="-810"/></w:pPr><w:r><w:rPr><w:b/><w:noProof/></w:rPr><mc:AlternateContent><mc:Choice Requires="wps"><w:drawing><wp:anchor distT="0" distB="0" distL="114300" distR="114300" simplePos="0" relativeHeight="251661312" behindDoc="0" locked="0" layoutInCell="1" allowOverlap="1" wp14:anchorId="589C343A" wp14:editId="66C5D7BF"><wp:simplePos x="0" y="0"/><wp:positionH relativeFrom="column"><wp:posOffset>-9525</wp:posOffset></wp:positionH><wp:positionV relativeFrom="paragraph"><wp:posOffset>3175</wp:posOffset></wp:positionV><wp:extent cx="6515100" cy="617855"/><wp:effectExtent l="0" t="0" r="0" b="0"/><wp:wrapNone/><wp:docPr id="1" name="Text Box 4"/><wp:cNvGraphicFramePr><a:graphicFrameLocks xmlns:a="http://schemas.openxmlformats.org/drawingml/2006/main"/></wp:cNvGraphicFramePr><a:graphic xmlns:a="http://schemas.openxmlformats.org/drawingml/2006/main"><a:graphicData uri="http://schemas.microsoft.com/office/word/2010/wordprocessingShape"><wps:wsp><wps:cNvSpPr txBox="1"><a:spLocks noChangeArrowheads="1"/></wps:cNvSpPr><wps:spPr bwMode="auto"><a:xfrm><a:off x="0" y="0"/><a:ext cx="6515100" cy="617855"/></a:xfrm><a:prstGeom prst="rect"><a:avLst/></a:prstGeom><a:noFill/><a:ln w="6350"><a:solidFill><a:srgbClr val="000000"/></a:solidFill><a:miter lim="800000"/><a:headEnd/><a:tailEnd/></a:ln></wps:spPr><wps:txbx><w:txbxContent><w:p><w:pPr><w:rPr><w:sz w:val="20"/></w:rPr></w:pPr><w:r><w:rPr><w:sz w:val="20"/></w:rPr><w:t>All state issued clothing and all his personal property. Inmate will be allowed to retain the following items</w:t></w:r></w:p><w:p><w:pPr><w:rPr><w:sz w:val="20"/></w:rPr></w:pPr><w:r><w:t xml:space="preserve">Mattress:	{{mattressLine}}</w:t></w:r></w:p><w:p><w:pPr><w:rPr><w:sz w:val="20"/></w:rPr></w:pPr><w:r><w:t xml:space="preserve">Bedding/Linens	{{beddingLine}}</w:t></w:r></w:p><w:p><w:pPr><w:rPr><w:sz w:val="20"/></w:rPr></w:pPr></w:p><w:p><w:pPr><w:rPr><w:sz w:val="20"/></w:rPr></w:pPr></w:p><w:p><w:pPr><w:rPr><w:sz w:val="20"/></w:rPr></w:pPr></w:p><w:p><w:pPr><w:rPr><w:sz w:val="20"/></w:rPr></w:pPr></w:p><w:p><w:pPr><w:rPr><w:sz w:val="20"/></w:rPr></w:pPr></w:p><w:p><w:pPr><w:rPr><w:sz w:val="20"/></w:rPr></w:pPr></w:p><w:p><w:pPr><w:rPr><w:sz w:val="20"/></w:rPr></w:pPr></w:p><w:p><w:pPr><w:rPr><w:sz w:val="20"/></w:rPr></w:pPr></w:p><w:p/><w:p/><w:p/><w:p/><w:p/><w:p/><w:p/><w:p/><w:p/><w:p/><w:p/><w:p/><w:p/><w:p/></w:txbxContent></wps:txbx><wps:bodyPr rot="0" vert="horz" wrap="square" lIns="91440" tIns="45720" rIns="91440" bIns="45720" anchor="t" anchorCtr="0" upright="1"><a:noAutofit/></wps:bodyPr></wps:wsp></a:graphicData></a:graphic><wp14:sizeRelH relativeFrom="page"><wp14:pctWidth>0</wp14:pctWidth></wp14:sizeRelH><wp14:sizeRelV relativeFrom="margin"><wp14:pctHeight>0</wp14:pctHeight></wp14:sizeRelV></wp:anchor></w:drawing></mc:Choice><mc:Fallback><w:pict><v:shape w14:anchorId="589C343A" id="Text Box 4" o:spid="_x0000_s1027" type="#_x0000_t202" style="position:absolute;margin-left:-.75pt;margin-top:.25pt;width:513pt;height:48.65pt;z-index:251661312;visibility:visible;mso-wrap-style:square;mso-width-percent:0;mso-height-percent:0;mso-wrap-distance-left:9pt;mso-wrap-distance-top:0;mso-wrap-distance-right:9pt;mso-wrap-distance-bottom:0;mso-position-horizontal:absolute;mso-position-horizontal-relative:text;mso-position-vertical:absolute;mso-position-vertical-relative:text;mso-width-percent:0;mso-height-percent:0;mso-width-relative:page;mso-height-relative:margin;v-text-anchor:top" o:gfxdata="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" filled="f" strokeweight=".5pt"><v:textbox><w:txbxContent><w:p><w:pPr><w:rPr><w:sz w:val="20"/></w:rPr></w:pPr><w:r><w:rPr><w:sz w:val="20"/></w:rPr><w:t xml:space="preserve">All state issued clothing and all his personal property. Inmate will be allowed to retain the following </w:t></w:r><w:proofErr w:type="gramStart"/><w:r><w:rPr><w:sz w:val="20"/></w:rPr><w:t>items</w:t></w:r><w:proofErr w:type="gramEnd"/></w:p><w:p><w:pPr><w:rPr><w:sz w:val="20"/></w:rPr></w:pPr><w:r><w:t xml:space="preserve">Mattress:	{{mattressLine}}</w:t></w:r></w:p><w:p><w:pPr><w:rPr><w:sz w:val="20"/></w:rPr></w:pPr><w:r><w:t xml:space="preserve">Bedding/Linens	{{beddingLine}}</w:t></w:r></w:p><w:p><w:pPr><w:rPr><w:sz w:val="20"/></w:rPr></w:pPr></w:p><w:p><w:pPr><w:rPr><w:sz w:val="20"/></w:rPr></w:pPr></w:p><w:p><w:pPr><w:rPr><w:sz w:val="20"/></w:rPr></w:pPr></w:p><w:p><w:pPr><w:rPr><w:sz w:val="20"/></w:rPr></w:pPr></w:p><w:p><w:pPr><w:rPr><w:sz w:val="20"/></w:rPr></w:pPr></w:p><w:p><w:pPr><w:rPr><w:sz w:val="20"/></w:rPr></w:pPr></w:p><w:p><w:pPr><w:rPr><w:sz w:val="20"/></w:rPr></w:pPr></w:p><w:p><w:pPr><w:rPr><w:sz w:val="20"/></w:rPr></w:pPr></w:p><w:p/><w:p/><w:p/><w:p/><w:p/><w:p/><w:p/><w:p/><w:p/><w:p/><w:p/><w:p/><w:p/><w:p/></w:txbxContent></v:textbox></v:shape></w:pict></mc:Fallback></mc:AlternateContent></w:r></w:p><w:p><w:pPr><w:ind w:right="-810"/></w:pPr></w:p><w:p><w:pPr><w:ind w:right="-810"/></w:pPr></w:p><w:p><w:pPr><w:ind w:right="-810"/></w:pPr></w:p><w:p><w:pPr><w:ind w:right="-810"/></w:pPr><w:r><w:t xml:space="preserve">{{supervisorName}}</w:t></w:r></w:p></w:tc><w:tc><w:tcPr><w:tcW w:w="270" w:type="dxa"/><w:tcBorders><w:top w:val="nil"/><w:left w:val="nil"/><w:bottom w:val="nil"/><w:right w:val="nil"/></w:tcBorders><w:vAlign w:val="bottom"/></w:tcPr><w:p><w:pPr><w:ind w:right="-810"/></w:pPr></w:p></w:tc><w:tc><w:tcPr><w:tcW w:w="1980" w:type="dxa"/><w:tcBorders><w:top w:val="nil"/><w:left w:val="nil"/><w:bottom w:val="single" w:sz="4" w:space="0" w:color="auto"/><w:right w:val="nil"/></w:tcBorders><w:vAlign w:val="bottom"/></w:tcPr><w:p><w:pPr><w:ind w:right="-810"/></w:pPr><w:r><w:t xml:space="preserve">{{supervisorDate}}</w:t></w:r></w:p></w:tc><w:tc><w:tcPr><w:tcW w:w="2970" w:type="dxa"/><w:gridSpan w:val="5"/><w:tcBorders><w:top w:val="nil"/><w:left w:val="nil"/><w:bottom w:val="nil"/><w:right w:val="nil"/></w:tcBorders><w:vAlign w:val="bottom"/></w:tcPr><w:p><w:pPr><w:ind w:right="-810"/></w:pPr></w:p></w:tc></w:tr><w:tr><w:trPr><w:trHeight w:val="216"/></w:trPr><w:tc><w:tcPr><w:tcW w:w="5310" w:type="dxa"/><w:gridSpan w:val="2"/><w:tcBorders><w:top w:val="nil"/><w:left w:val="nil"/><w:bottom w:val="nil"/><w:right w:val="nil"/></w:tcBorders><w:vAlign w:val="bottom"/></w:tcPr><w:p><w:pPr><w:ind w:right="-810"/><w:rPr><w:sz w:val="20"/></w:rPr></w:pPr><w:r><w:rPr><w:sz w:val="20"/></w:rPr><w:t>Shift Supervisor</w:t></w:r></w:p></w:tc><w:tc><w:tcPr><w:tcW w:w="4950" w:type="dxa"/><w:gridSpan w:val="6"/><w:tcBorders><w:top w:val="nil"/><w:left w:val="nil"/><w:bottom w:val="nil"/><w:right w:val="nil"/></w:tcBorders><w:vAlign w:val="bottom"/></w:tcPr><w:p><w:pPr><w:ind w:right="-810"/><w:rPr><w:sz w:val="20"/></w:rPr></w:pPr><w:r><w:rPr><w:sz w:val="20"/></w:rPr><w:t>Date</w:t></w:r></w:p></w:tc></w:tr><w:tr><w:trPr><w:trHeight w:val="432"/></w:trPr><w:tc><w:tcPr><w:tcW w:w="5040" w:type="dxa"/><w:tcBorders><w:top w:val="nil"/><w:left w:val="nil"/><w:bottom w:val="single" w:sz="4" w:space="0" w:color="auto"/><w:right w:val="nil"/></w:tcBorders><w:vAlign w:val="bottom"/></w:tcPr><w:p><w:pPr><w:ind w:right="-810"/></w:pPr><w:r><w:t xml:space="preserve">{{chiefName}}</w:t></w:r></w:p></w:tc><w:tc><w:tcPr><w:tcW w:w="270" w:type="dxa"/><w:tcBorders><w:top w:val="nil"/><w:left w:val="nil"/><w:bottom w:val="nil"/><w:right w:val="nil"/></w:tcBorders><w:vAlign w:val="bottom"/></w:tcPr><w:p><w:pPr><w:ind w:right="-810"/></w:pPr></w:p></w:tc><w:tc><w:tcPr><w:tcW w:w="1980" w:type="dxa"/><w:tcBorders><w:top w:val="nil"/><w:left w:val="nil"/><w:bottom w:val="single" w:sz="4" w:space="0" w:color="auto"/><w:right w:val="nil"/></w:tcBorders><w:vAlign w:val="bottom"/></w:tcPr><w:p><w:pPr><w:ind w:right="-810"/></w:pPr><w:r><w:t xml:space="preserve">{{chiefDate}}</w:t></w:r></w:p></w:tc><w:tc><w:tcPr><w:tcW w:w="540" w:type="dxa"/><w:tcBorders><w:top w:val="nil"/><w:left w:val="nil"/><w:bottom w:val="nil"/><w:right w:val="nil"/></w:tcBorders><w:vAlign w:val="bottom"/></w:tcPr><w:p><w:pPr><w:ind w:right="-810"/></w:pPr></w:p></w:tc><w:tc><w:tcPr><w:tcW w:w="1080" w:type="dxa"/><w:tcBorders><w:top w:val="nil"/><w:left w:val="nil"/><w:bottom w:val="single" w:sz="4" w:space="0" w:color="auto"/><w:right w:val="nil"/></w:tcBorders><w:vAlign w:val="bottom"/></w:tcPr><w:p><w:pPr><w:ind w:right="-810"/></w:pPr><w:r><w:t xml:space="preserve">{{approvalX}}</w:t></w:r></w:p></w:tc><w:tc><w:tcPr><w:tcW w:w="270" w:type="dxa"/><w:gridSpan w:val="2"/><w:tcBorders><w:top w:val="nil"/><w:left w:val="nil"/><w:bottom w:val="nil"/><w:right w:val="nil"/></w:tcBorders><w:vAlign w:val="bottom"/></w:tcPr><w:p><w:pPr><w:ind w:right="-810"/></w:pPr></w:p></w:tc><w:tc><w:tcPr><w:tcW w:w="1080" w:type="dxa"/><w:tcBorders><w:top w:val="nil"/><w:left w:val="nil"/><w:bottom w:val="single" w:sz="4" w:space="0" w:color="auto"/><w:right w:val="nil"/></w:tcBorders><w:vAlign w:val="bottom"/></w:tcPr><w:p><w:pPr><w:ind w:right="-810"/></w:pPr><w:r><w:t xml:space="preserve">  </w:t></w:r></w:p></w:tc></w:tr><w:tr><w:trPr><w:trHeight w:val="216"/></w:trPr><w:tc><w:tcPr><w:tcW w:w="5310" w:type="dxa"/><w:gridSpan w:val="2"/><w:tcBorders><w:top w:val="nil"/><w:left w:val="nil"/><w:bottom w:val="nil"/><w:right w:val="nil"/></w:tcBorders><w:vAlign w:val="bottom"/></w:tcPr><w:p><w:pPr><w:ind w:right="-810"/><w:rPr><w:sz w:val="20"/></w:rPr></w:pPr><w:r><w:rPr><w:sz w:val="20"/></w:rPr><w:t>Correctional Officer Chief</w:t></w:r></w:p></w:tc><w:tc><w:tcPr><w:tcW w:w="2520" w:type="dxa"/><w:gridSpan w:val="2"/><w:tcBorders><w:top w:val="nil"/><w:left w:val="nil"/><w:bottom w:val="nil"/><w:right w:val="nil"/></w:tcBorders><w:vAlign w:val="bottom"/></w:tcPr><w:p><w:pPr><w:ind w:right="-810"/><w:rPr><w:sz w:val="20"/></w:rPr></w:pPr><w:r><w:rPr><w:sz w:val="20"/></w:rPr><w:t>Date</w:t></w:r></w:p></w:tc><w:tc><w:tcPr><w:tcW w:w="1170" w:type="dxa"/><w:gridSpan w:val="2"/><w:tcBorders><w:top w:val="nil"/><w:left w:val="nil"/><w:bottom w:val="nil"/><w:right w:val="nil"/></w:tcBorders><w:tcMar><w:left w:w="0" w:type="dxa"/><w:right w:w="115" w:type="dxa"/></w:tcMar><w:vAlign w:val="bottom"/></w:tcPr><w:p><w:pPr><w:ind w:right="-810"/><w:rPr><w:sz w:val="20"/></w:rPr></w:pPr><w:r><w:rPr><w:sz w:val="20"/></w:rPr><w:t xml:space="preserve"> </w:t></w:r><w:r><w:rPr><w:sz w:val="20"/></w:rPr><w:t xml:space="preserve"> </w:t></w:r><w:r><w:rPr><w:sz w:val="20"/></w:rPr><w:t>Approved</w:t></w:r></w:p></w:tc><w:tc><w:tcPr><w:tcW w:w="1260" w:type="dxa"/><w:gridSpan w:val="2"/><w:tcBorders><w:top w:val="nil"/><w:left w:val="nil"/><w:bottom w:val="nil"/><w:right w:val="nil"/></w:tcBorders><w:vAlign w:val="bottom"/></w:tcPr><w:p><w:pPr><w:ind w:right="-810"/><w:rPr><w:sz w:val="20"/></w:rPr></w:pPr><w:r><w:rPr><w:sz w:val="20"/></w:rPr><w:t xml:space="preserve">    </w:t></w:r><w:r><w:rPr><w:sz w:val="20"/></w:rPr><w:t xml:space="preserve">  </w:t></w:r><w:r><w:rPr><w:sz w:val="20"/></w:rPr><w:t>Denied</w:t></w:r></w:p></w:tc></w:tr></w:tbl><w:p><w:pPr><w:ind w:left="-810" w:right="-810"/><w:rPr><w:b/><w:sz w:val="16"/></w:rPr></w:pPr></w:p><w:p><w:pPr><w:ind w:left="-810" w:right="-810"/></w:pPr><w:r><w:t>Comments:</w:t></w:r></w:p><w:p><w:pPr><w:ind w:left="-810" w:right="-810"/></w:pPr><w:r><w:rPr><w:noProof/></w:rPr><mc:AlternateContent><mc:Choice Requires="wps"><w:drawing><wp:anchor distT="0" distB="0" distL="114300" distR="114300" simplePos="0" relativeHeight="251663360" behindDoc="0" locked="0" layoutInCell="1" allowOverlap="1" wp14:anchorId="7B8C6936" wp14:editId="0E2BA18C"><wp:simplePos x="0" y="0"/><wp:positionH relativeFrom="column"><wp:posOffset>-523875</wp:posOffset></wp:positionH><wp:positionV relativeFrom="paragraph"><wp:posOffset>10795</wp:posOffset></wp:positionV><wp:extent cx="6515100" cy="419100"/><wp:effectExtent l="0" t="0" r="0" b="0"/><wp:wrapNone/><wp:docPr id="5" name="Text Box 5"/><wp:cNvGraphicFramePr><a:graphicFrameLocks xmlns:a="http://schemas.openxmlformats.org/drawingml/2006/main"/></wp:cNvGraphicFramePr><a:graphic xmlns:a="http://schemas.openxmlformats.org/drawingml/2006/main"><a:graphicData uri="http://schemas.microsoft.com/office/word/2010/wordprocessingShape"><wps:wsp><wps:cNvSpPr txBox="1"><a:spLocks/></wps:cNvSpPr><wps:spPr><a:xfrm><a:off x="0" y="0"/><a:ext cx="6515100" cy="419100"/></a:xfrm><a:prstGeom prst="rect"><a:avLst/></a:prstGeom><a:solidFill><a:sysClr val="window" lastClr="FFFFFF"/></a:solidFill><a:ln w="6350"><a:solidFill><a:prstClr val="black"/></a:solidFill></a:ln><a:effectLst/></wps:spPr><wps:txbx><w:txbxContent><w:p><w:pPr><w:rPr><w:sz w:val="20"/></w:rPr></w:pPr></w:p><w:p/><w:p/><w:p/><w:p/><w:p/><w:p/><w:p/><w:p/><w:p/><w:p/><w:p/><w:p/><w:p/><w:p/><w:p/><w:p/></w:txbxContent></wps:txbx><wps:bodyPr rot="0" spcFirstLastPara="0" vertOverflow="overflow" horzOverflow="overflow" vert="horz" wrap="square" lIns="91440" tIns="45720" rIns="91440" bIns="45720" numCol="1" spcCol="0" rtlCol="0" fromWordArt="0" anchor="t" anchorCtr="0" forceAA="0" compatLnSpc="1"><a:prstTxWarp prst="textNoShape"><a:avLst/></a:prstTxWarp><a:noAutofit/></wps:bodyPr></wps:wsp></a:graphicData></a:graphic><wp14:sizeRelH relativeFrom="page"><wp14:pctWidth>0</wp14:pctWidth></wp14:sizeRelH><wp14:sizeRelV relativeFrom="margin"><wp14:pctHeight>0</wp14:pctHeight></wp14:sizeRelV></wp:anchor></w:drawing></mc:Choice><mc:Fallback><w:pict><v:shape w14:anchorId="7B8C6936" id="Text Box 5" o:spid="_x0000_s1028" type="#_x0000_t202" style="position:absolute;left:0;text-align:left;margin-left:-41.25pt;margin-top:.85pt;width:513pt;height:33pt;z-index:251663360;visibility:visible;mso-wrap-style:square;mso-width-percent:0;mso-height-percent:0;mso-wrap-distance-left:9pt;mso-wrap-distance-top:0;mso-wrap-distance-right:9pt;mso-wrap-distance-bottom:0;mso-position-horizontal:absolute;mso-position-horizontal-relative:text;mso-position-vertical:absolute;mso-position-vertical-relative:text;mso-width-percent:0;mso-height-percent:0;mso-width-relative:page;mso-height-relative:margin;v-text-anchor:top" o:gfxdata="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" fillcolor="window" strokeweight=".5pt"><v:path arrowok="t"/><v:textbox><w:txbxContent><w:p><w:pPr><w:rPr><w:sz w:val="20"/></w:rPr></w:pPr></w:p><w:p/><w:p/><w:p/><w:p/><w:p/><w:p/><w:p/><w:p/><w:p/><w:p/><w:p/><w:p/><w:p/><w:p/><w:p/><w:p/></w:txbxContent></v:textbox></v:shape></w:pict></mc:Fallback></mc:AlternateContent></w:r></w:p><w:p><w:pPr><w:ind w:left="-810" w:right="-810"/></w:pPr></w:p><w:p><w:pPr><w:ind w:left="-810" w:right="-810"/></w:pPr></w:p><w:p><w:pPr><w:ind w:left="-810" w:right="-810"/></w:pPr><w:r><w:t>Items will be restricted at a minimum until:</w:t></w:r><w:r><w:t xml:space="preserve"> </w:t></w:r><w:r><w:t>__</w:t></w:r><w:r><w:t>0</w:t></w:r><w:r><w:t>4</w:t></w:r><w:r><w:t>/</w:t></w:r><w:r><w:t>7</w:t></w:r><w:r><w:t>/2026</w:t></w:r><w:r><w:t>_</w:t></w:r></w:p><w:p><w:pPr><w:ind w:left="-810" w:right="-810"/></w:pPr><w:r><w:t xml:space="preserve">Items Returned:		Date {{retDate}}		Shift {{retShift}}		OIC {{retOIC}}</w:t></w:r></w:p><w:tbl><w:tblPr><w:tblStyle w:val="TableGrid"/><w:tblW w:w="10260" w:type="dxa"/><w:tblInd w:w="-702" w:type="dxa"/><w:tblLook w:val="04A0" w:firstRow="1" w:lastRow="0" w:firstColumn="1" w:lastColumn="0" w:noHBand="0" w:noVBand="1"/></w:tblPr><w:tblGrid><w:gridCol w:w="7560"/><w:gridCol w:w="1350"/><w:gridCol w:w="1350"/></w:tblGrid><w:tr><w:tc><w:tcPr><w:tcW w:w="7560" w:type="dxa"/></w:tcPr><w:p><w:pPr><w:ind w:right="-810"/></w:pPr></w:p></w:tc><w:tc><w:tcPr><w:tcW w:w="1350" w:type="dxa"/></w:tcPr><w:p><w:pPr><w:ind w:right="-810"/></w:pPr><w:r><w:t xml:space="preserve">{{comments}}</w:t></w:r></w:p></w:tc><w:tc><w:tcPr><w:tcW w:w="1350" w:type="dxa"/></w:tcPr><w:p><w:pPr><w:ind w:right="-810"/></w:pPr></w:p></w:tc></w:tr><w:tr><w:tc><w:tcPr><w:tcW w:w="7560" w:type="dxa"/></w:tcPr><w:p><w:pPr><w:ind w:right="-810"/></w:pPr></w:p></w:tc><w:tc><w:tcPr><w:tcW w:w="1350" w:type="dxa"/></w:tcPr><w:p><w:pPr><w:ind w:right="-810"/></w:pPr></w:p></w:tc><w:tc><w:tcPr><w:tcW w:w="1350" w:type="dxa"/></w:tcPr><w:p><w:pPr><w:ind w:right="-810"/></w:pPr></w:p></w:tc></w:tr><w:tr><w:tc><w:tcPr><w:tcW w:w="7560" w:type="dxa"/></w:tcPr><w:p><w:pPr><w:ind w:right="-810"/></w:pPr></w:p></w:tc><w:tc><w:tcPr><w:tcW w:w="1350" w:type="dxa"/></w:tcPr><w:p><w:pPr><w:ind w:right="-810"/></w:pPr></w:p></w:tc><w:tc><w:tcPr><w:tcW w:w="1350" w:type="dxa"/></w:tcPr><w:p><w:pPr><w:ind w:right="-810"/></w:pPr></w:p></w:tc></w:tr><w:tr><w:tc><w:tcPr><w:tcW w:w="7560" w:type="dxa"/></w:tcPr><w:p><w:pPr><w:ind w:right="-810"/></w:pPr></w:p></w:tc><w:tc><w:tcPr><w:tcW w:w="1350" w:type="dxa"/></w:tcPr><w:p><w:pPr><w:ind w:right="-810"/></w:pPr></w:p></w:tc><w:tc><w:tcPr><w:tcW w:w="1350" w:type="dxa"/></w:tcPr><w:p><w:pPr><w:ind w:right="-810"/></w:pPr></w:p></w:tc></w:tr></w:tbl><w:p><w:pPr><w:ind w:left="-810" w:right="-810"/><w:jc w:val="both"/></w:pPr><w:r><w:rPr><w:sz w:val="20"/><w:szCs w:val="20"/></w:rPr><w:t>This form is to be completed</w:t></w:r><w:r><w:rPr><w:sz w:val="20"/><w:szCs w:val="20"/></w:rPr><w:t xml:space="preserve"> and attached to an incident report</w:t></w:r><w:r><w:rPr><w:sz w:val="20"/><w:szCs w:val="20"/></w:rPr><w:t xml:space="preserve"> on all inmates that are placed on property restriction for security reasons. This form does not apply to items or property restricted by Mental Health or Medical Personnel for suicide watch or Alternative Housing. All property restricted and returned must also be documented on the inmate DC6-229. Items will be returned to the inmate when no further behavior or threat of behavior occurs that led to the restriction. If the inmate behavior or threat of behavior continues after 72 hours the </w:t></w:r><w:r><w:rPr><w:b/><w:i/><w:color w:val="FF0000"/><w:sz w:val="20"/><w:szCs w:val="20"/><w:u w:val="single"/></w:rPr><w:t>Warden</w:t></w:r><w:r><w:rPr><w:sz w:val="20"/><w:szCs w:val="20"/></w:rPr><w:t xml:space="preserve"> must approve for the continuation of the property restriction, this review will be conducted within 72 hours of the restriction. </w:t></w:r><w:r><w:rPr><w:b/><w:sz w:val="20"/><w:szCs w:val="20"/></w:rPr><w:t>At no time will an inmate be left without the means to cover himself. All property being taken will be inventoried and properly stored in compliance of F.A.C. 33-602.201 Inmate Property.</w:t></w:r></w:p><w:sectPr><w:pgSz w:w="12240" w:h="15840"/><w:pgMar w:top="576" w:right="1800" w:bottom="432" w:left="1800" w:header="720" w:footer="720" w:gutter="0"/><w:cols w:space="720"/><w:docGrid w:linePitch="360"/></w:sectPr></w:body></w:document>
+<file path=word/document.xml><?xml version="1.0" encoding="utf-8"?>
+<w:document xmlns:wpc="http://schemas.microsoft.com/office/word/2010/wordprocessingCanvas" xmlns:cx="http://schemas.microsoft.com/office/drawing/2014/chartex" xmlns:cx1="http://schemas.microsoft.com/office/drawing/2015/9/8/chartex" xmlns:cx2="http://schemas.microsoft.com/office/drawing/2015/10/21/chartex" xmlns:cx3="http://schemas.microsoft.com/office/drawing/2016/5/9/chartex" xmlns:cx4="http://schemas.microsoft.com/office/drawing/2016/5/10/chartex" xmlns:cx5="http://schemas.microsoft.com/office/drawing/2016/5/11/chartex" xmlns:cx6="http://schemas.microsoft.com/office/drawing/2016/5/12/chartex" xmlns:cx7="http://schemas.microsoft.com/office/drawing/2016/5/13/chartex" xmlns:cx8="http://schemas.microsoft.com/office/drawing/2016/5/14/chartex" xmlns:mc="http://schemas.openxmlformats.org/markup-compatibility/2006" xmlns:aink="http://schemas.microsoft.com/office/drawing/2016/ink" xmlns:am3d="http://schemas.microsoft.com/office/drawing/2017/model3d" xmlns:o="urn:schemas-microsoft-com:office:office" xmlns:oel="http://schemas.microsoft.com/office/2019/extlst" xmlns:r="http://schemas.openxmlformats.org/officeDocument/2006/relationships" xmlns:m="http://schemas.openxmlformats.org/officeDocument/2006/math" xmlns:v="urn:schemas-microsoft-com:vml" xmlns:wp14="http://schemas.microsoft.com/office/word/2010/wordprocessingDrawing" xmlns:wp="http://schemas.openxmlformats.org/drawingml/2006/wordprocessingDrawing" xmlns:w10="urn:schemas-microsoft-com:office:word" xmlns:w="http://schemas.openxmlformats.org/wordprocessingml/2006/main" xmlns:w14="http://schemas.microsoft.com/office/word/2010/wordml" xmlns:w15="http://schemas.microsoft.com/office/word/2012/wordml" xmlns:w16cex="http://schemas.microsoft.com/office/word/2018/wordml/cex" xmlns:w16cid="http://schemas.microsoft.com/office/word/2016/wordml/cid" xmlns:w16="http://schemas.microsoft.com/office/word/2018/wordml" xmlns:w16du="http://schemas.microsoft.com/office/word/2023/wordml/word16du" xmlns:w16sdtdh="http://schemas.microsoft.com/office/word/2020/wordml/sdtdatahash" xmlns:w16sdtfl="http://schemas.microsoft.com/office/word/2024/wordml/sdtformatlock" xmlns:w16se="http://schemas.microsoft.com/office/word/2015/wordml/symex" xmlns:wpg="http://schemas.microsoft.com/office/word/2010/wordprocessingGroup" xmlns:wpi="http://schemas.microsoft.com/office/word/2010/wordprocessingInk" xmlns:wne="http://schemas.microsoft.com/office/word/2006/wordml" xmlns:wps="http://schemas.microsoft.com/office/word/2010/wordprocessingShape" mc:Ignorable="w14 w15 w16se w16cid w16 w16cex w16sdtdh w16sdtfl w16du wp14">
+  <w:body>
+    <w:p>
+      <w:pPr>
+        <w:jc w:val="center"/>
+      </w:pPr>
+      <w:r>
+        <w:t>S</w:t>
+      </w:r>
+      <w:r>
+        <w:t>tate of Florida</w:t>
+      </w:r>
+    </w:p>
+    <w:p>
+      <w:pPr>
+        <w:jc w:val="center"/>
+      </w:pPr>
+      <w:r>
+        <w:t>Department of Corrections</w:t>
+      </w:r>
+    </w:p>
+    <w:p>
+      <w:pPr>
+        <w:jc w:val="center"/>
+      </w:pPr>
+      <w:r>
+        <w:t>Okeechobee</w:t>
+      </w:r>
+      <w:r>
+        <w:t xml:space="preserve"> Correctional Institution</w:t>
+      </w:r>
+    </w:p>
+    <w:p>
+      <w:pPr>
+        <w:jc w:val="center"/>
+        <w:rPr>
+          <w:b/>
+        </w:rPr>
+      </w:pPr>
+      <w:r>
+        <w:rPr>
+          <w:b/>
+        </w:rPr>
+        <w:t>PROPERTY RESTRICTION FORM</w:t>
+      </w:r>
+    </w:p>
+    <w:p>
+      <w:pPr>
+        <w:jc w:val="center"/>
+      </w:pPr>
+    </w:p>
+    <w:tbl>
+      <w:tblPr>
+        <w:tblStyle w:val="TableGrid"/>
+        <w:tblW w:w="10260" w:type="dxa"/>
+        <w:tblInd w:w="-702" w:type="dxa"/>
+        <w:tblBorders>
+          <w:top w:val="none" w:sz="0" w:space="0" w:color="auto"/>
+          <w:left w:val="none" w:sz="0" w:space="0" w:color="auto"/>
+          <w:bottom w:val="none" w:sz="0" w:space="0" w:color="auto"/>
+          <w:right w:val="none" w:sz="0" w:space="0" w:color="auto"/>
+          <w:insideH w:val="none" w:sz="0" w:space="0" w:color="auto"/>
+          <w:insideV w:val="none" w:sz="0" w:space="0" w:color="auto"/>
+        </w:tblBorders>
+        <w:tblLook w:val="04A0" w:firstRow="1" w:lastRow="0" w:firstColumn="1" w:lastColumn="0" w:noHBand="0" w:noVBand="1"/>
+      </w:tblPr>
+      <w:tblGrid>
+        <w:gridCol w:w="1620"/>
+        <w:gridCol w:w="180"/>
+        <w:gridCol w:w="1680"/>
+        <w:gridCol w:w="750"/>
+        <w:gridCol w:w="1710"/>
+        <w:gridCol w:w="613"/>
+        <w:gridCol w:w="737"/>
+        <w:gridCol w:w="720"/>
+        <w:gridCol w:w="2250"/>
+      </w:tblGrid>
+      <w:tr>
+        <w:trPr>
+          <w:trHeight w:val="432"/>
+        </w:trPr>
+        <w:tc>
+          <w:tcPr>
+            <w:tcW w:w="1620" w:type="dxa"/>
+            <w:vAlign w:val="bottom"/>
+          </w:tcPr>
+          <w:p>
+            <w:r>
+              <w:t>Inmate Name:</w:t>
+            </w:r>
+          </w:p>
+        </w:tc>
+        <w:tc>
+          <w:tcPr>
+            <w:tcW w:w="4933" w:type="dxa"/>
+            <w:gridSpan w:val="5"/>
+            <w:tcBorders>
+              <w:bottom w:val="single" w:sz="4" w:space="0" w:color="auto"/>
+            </w:tcBorders>
+            <w:vAlign w:val="bottom"/>
+          </w:tcPr>
+          <w:p>
+            <w:pPr>
+              <w:pStyle w:val="HTMLPreformatted"/>
+              <w:rPr>
+                <w:color w:val="000000"/>
+              </w:rPr>
+            </w:pPr>
+            <w:r>
+              <w:rPr>
+                <w:color w:val="000000"/>
+              </w:rPr>
+              <w:t>{{inmateFullName}}</w:t>
+            </w:r>
+          </w:p>
+        </w:tc>
+        <w:tc>
+          <w:tcPr>
+            <w:tcW w:w="737" w:type="dxa"/>
+            <w:vAlign w:val="bottom"/>
+          </w:tcPr>
+          <w:p>
+            <w:r>
+              <w:t>DC#:</w:t>
+            </w:r>
+          </w:p>
+        </w:tc>
+        <w:tc>
+          <w:tcPr>
+            <w:tcW w:w="2970" w:type="dxa"/>
+            <w:gridSpan w:val="2"/>
+            <w:tcBorders>
+              <w:bottom w:val="single" w:sz="4" w:space="0" w:color="auto"/>
+            </w:tcBorders>
+            <w:vAlign w:val="bottom"/>
+          </w:tcPr>
+          <w:p>
+            <w:pPr>
+              <w:pStyle w:val="HTMLPreformatted"/>
+              <w:rPr>
+                <w:color w:val="000000"/>
+              </w:rPr>
+            </w:pPr>
+            <w:r>
+              <w:rPr>
+                <w:color w:val="000000"/>
+              </w:rPr>
+              <w:t>X89985</w:t>
+            </w:r>
+            <w:r>
+              <w:rPr>
+                <w:color w:val="000000"/>
+              </w:rPr>
+              <w:t xml:space="preserve"> </w:t>
+            </w:r>
+          </w:p>
+        </w:tc>
+      </w:tr>
+      <w:tr>
+        <w:trPr>
+          <w:trHeight w:val="432"/>
+        </w:trPr>
+        <w:tc>
+          <w:tcPr>
+            <w:tcW w:w="1800" w:type="dxa"/>
+            <w:gridSpan w:val="2"/>
+            <w:vAlign w:val="bottom"/>
+          </w:tcPr>
+          <w:p>
+            <w:r>
+              <w:t>Date Restricted:</w:t>
+            </w:r>
+          </w:p>
+        </w:tc>
+        <w:tc>
+          <w:tcPr>
+            <w:tcW w:w="1680" w:type="dxa"/>
+            <w:tcBorders>
+              <w:bottom w:val="single" w:sz="4" w:space="0" w:color="auto"/>
+            </w:tcBorders>
+            <w:vAlign w:val="bottom"/>
+          </w:tcPr>
+          <w:p>
+            <w:pPr>
+              <w:rPr>
+                <w:b/>
+              </w:rPr>
+            </w:pPr>
+            <w:r>
+              <w:rPr>
+                <w:b/>
+              </w:rPr>
+              <w:t>{{dateRestricted}}</w:t>
+            </w:r>
+          </w:p>
+        </w:tc>
+        <w:tc>
+          <w:tcPr>
+            <w:tcW w:w="750" w:type="dxa"/>
+            <w:vAlign w:val="bottom"/>
+          </w:tcPr>
+          <w:p>
+            <w:r>
+              <w:t>Shift:</w:t>
+            </w:r>
+          </w:p>
+        </w:tc>
+        <w:tc>
+          <w:tcPr>
+            <w:tcW w:w="1710" w:type="dxa"/>
+            <w:tcBorders>
+              <w:bottom w:val="single" w:sz="4" w:space="0" w:color="auto"/>
+            </w:tcBorders>
+            <w:vAlign w:val="bottom"/>
+          </w:tcPr>
+          <w:p>
+            <w:pPr>
+              <w:rPr>
+                <w:b/>
+              </w:rPr>
+            </w:pPr>
+            <w:r>
+              <w:rPr>
+                <w:b/>
+              </w:rPr>
+              <w:t>{{shift}}</w:t>
+            </w:r>
+          </w:p>
+        </w:tc>
+        <w:tc>
+          <w:tcPr>
+            <w:tcW w:w="2070" w:type="dxa"/>
+            <w:gridSpan w:val="3"/>
+            <w:vAlign w:val="bottom"/>
+          </w:tcPr>
+          <w:p>
+            <w:r>
+              <w:t>Dorm/Assignment:</w:t>
+            </w:r>
+          </w:p>
+        </w:tc>
+        <w:tc>
+          <w:tcPr>
+            <w:tcW w:w="2250" w:type="dxa"/>
+            <w:tcBorders>
+              <w:bottom w:val="single" w:sz="4" w:space="0" w:color="auto"/>
+            </w:tcBorders>
+            <w:vAlign w:val="bottom"/>
+          </w:tcPr>
+          <w:p>
+            <w:pPr>
+              <w:rPr>
+                <w:b/>
+              </w:rPr>
+            </w:pPr>
+            <w:r>
+              <w:rPr>
+                <w:b/>
+              </w:rPr>
+              <w:t>{{dormAssignment}}</w:t>
+            </w:r>
+          </w:p>
+        </w:tc>
+      </w:tr>
+    </w:tbl>
+    <w:p>
+      <w:pPr>
+        <w:jc w:val="center"/>
+        <w:rPr>
+          <w:b/>
+          <w:sz w:val="16"/>
+        </w:rPr>
+      </w:pPr>
+    </w:p>
+    <w:p>
+      <w:pPr>
+        <w:ind w:left="-810" w:right="-810"/>
+        <w:rPr>
+          <w:b/>
+        </w:rPr>
+      </w:pPr>
+      <w:r>
+        <w:rPr>
+          <w:b/>
+        </w:rPr>
+        <w:t>Reason for Restriction:</w:t>
+      </w:r>
+    </w:p>
+    <w:p>
+      <w:pPr>
+        <w:ind w:left="-810" w:right="-810"/>
+        <w:rPr>
+          <w:b/>
+        </w:rPr>
+      </w:pPr>
+      <w:r>
+        <w:rPr>
+          <w:b/>
+          <w:noProof/>
+        </w:rPr>
+        <mc:AlternateContent>
+          <mc:Choice Requires="wps">
+            <w:drawing>
+              <wp:anchor distT="0" distB="0" distL="114300" distR="114300" simplePos="0" relativeHeight="251659264" behindDoc="0" locked="0" layoutInCell="1" allowOverlap="1" wp14:anchorId="6F2E2707" wp14:editId="68D94713">
+                <wp:simplePos x="0" y="0"/>
+                <wp:positionH relativeFrom="column">
+                  <wp:posOffset>-455295</wp:posOffset>
+                </wp:positionH>
+                <wp:positionV relativeFrom="paragraph">
+                  <wp:posOffset>85725</wp:posOffset>
+                </wp:positionV>
+                <wp:extent cx="6515100" cy="2028825"/>
+                <wp:effectExtent l="0" t="0" r="0" b="9525"/>
+                <wp:wrapNone/>
+                <wp:docPr id="3" name="Text Box 3"/>
+                <wp:cNvGraphicFramePr>
+                  <a:graphicFrameLocks xmlns:a="http://schemas.openxmlformats.org/drawingml/2006/main"/>
+                </wp:cNvGraphicFramePr>
+                <a:graphic xmlns:a="http://schemas.openxmlformats.org/drawingml/2006/main">
+                  <a:graphicData uri="http://schemas.microsoft.com/office/word/2010/wordprocessingShape">
+                    <wps:wsp>
+                      <wps:cNvSpPr txBox="1">
+                        <a:spLocks/>
+                      </wps:cNvSpPr>
+                      <wps:spPr>
+                        <a:xfrm>
+                          <a:off x="0" y="0"/>
+                          <a:ext cx="6515100" cy="2028825"/>
+                        </a:xfrm>
+                        <a:prstGeom prst="rect">
+                          <a:avLst/>
+                        </a:prstGeom>
+                        <a:solidFill>
+                          <a:schemeClr val="lt1"/>
+                        </a:solidFill>
+                        <a:ln w="6350">
+                          <a:solidFill>
+                            <a:prstClr val="black"/>
+                          </a:solidFill>
+                        </a:ln>
+                        <a:effectLst/>
+                      </wps:spPr>
+                      <wps:style>
+                        <a:lnRef idx="0">
+                          <a:schemeClr val="accent1"/>
+                        </a:lnRef>
+                        <a:fillRef idx="0">
+                          <a:schemeClr val="accent1"/>
+                        </a:fillRef>
+                        <a:effectRef idx="0">
+                          <a:schemeClr val="accent1"/>
+                        </a:effectRef>
+                        <a:fontRef idx="minor">
+                          <a:schemeClr val="dk1"/>
+                        </a:fontRef>
+                      </wps:style>
+                      <wps:txbx>
+                        <w:txbxContent>
+                          <w:p>
+                            <w:r>
+                              <w:rPr>
+                                <w:rFonts w:asciiTheme="minorHAnsi" w:hAnsiTheme="minorHAnsi" w:cstheme="minorHAnsi"/>
+                                <w:sz w:val="22"/>
+                                <w:szCs w:val="22"/>
+                              </w:rPr>
+                              <w:t xml:space="preserve">{{reasonForRestriction}}</w:t>
+                            </w:r>
+                          </w:p>
+                        </w:txbxContent>
+                      </wps:txbx>
+                      <wps:bodyPr rot="0" spcFirstLastPara="0" vertOverflow="overflow" horzOverflow="overflow" vert="horz" wrap="square" lIns="91440" tIns="45720" rIns="91440" bIns="45720" numCol="1" spcCol="0" rtlCol="0" fromWordArt="0" anchor="t" anchorCtr="0" forceAA="0" compatLnSpc="1">
+                        <a:prstTxWarp prst="textNoShape">
+                          <a:avLst/>
+                        </a:prstTxWarp>
+                        <a:noAutofit/>
+                      </wps:bodyPr>
+                    </wps:wsp>
+                  </a:graphicData>
+                </a:graphic>
+                <wp14:sizeRelH relativeFrom="page">
+                  <wp14:pctWidth>0</wp14:pctWidth>
+                </wp14:sizeRelH>
+                <wp14:sizeRelV relativeFrom="margin">
+                  <wp14:pctHeight>0</wp14:pctHeight>
+                </wp14:sizeRelV>
+              </wp:anchor>
+            </w:drawing>
+          </mc:Choice>
+          <mc:Fallback>
+            <w:pict>
+              <v:shapetype w14:anchorId="6F2E2707" id="_x0000_t202" coordsize="21600,21600" o:spt="202" path="m,l,21600r21600,l21600,xe">
+                <v:stroke joinstyle="miter"/>
+                <v:path gradientshapeok="t" o:connecttype="rect"/>
+              </v:shapetype>
+              <v:shape id="Text Box 3" o:spid="_x0000_s1026" type="#_x0000_t202" style="position:absolute;left:0;text-align:left;margin-left:-35.85pt;margin-top:6.75pt;width:513pt;height:159.75pt;z-index:251659264;visibility:visible;mso-wrap-style:square;mso-width-percent:0;mso-height-percent:0;mso-wrap-distance-left:9pt;mso-wrap-distance-top:0;mso-wrap-distance-right:9pt;mso-wrap-distance-bottom:0;mso-position-horizontal:absolute;mso-position-horizontal-relative:text;mso-position-vertical:absolute;mso-position-vertical-relative:text;mso-width-percent:0;mso-height-percent:0;mso-width-relative:page;mso-height-relative:margin;v-text-anchor:top" o:gfxdata="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" fillcolor="white [3201]" strokeweight=".5pt">
+                <v:path arrowok="t"/>
+                <v:textbox>
+                  <w:txbxContent>
+                    <w:p>
+                      <w:pPr>
+                        <w:pStyle w:val="HTMLPreformatted"/>
+                        <w:rPr>
+                          <w:color w:val="000000"/>
+                        </w:rPr>
+                      </w:pPr>
+                      <w:r>
+                        <w:rPr>
+                          <w:rFonts w:asciiTheme="minorHAnsi" w:hAnsiTheme="minorHAnsi" w:cstheme="minorHAnsi"/>
+                          <w:sz w:val="22"/>
+                          <w:szCs w:val="22"/>
+                        </w:rPr>
+                        <w:t xml:space="preserve">I Sergeant S. Wildman was conducting a </w:t>
+                      </w:r>
+                      <w:r>
+                        <w:rPr>
+                          <w:rFonts w:asciiTheme="minorHAnsi" w:hAnsiTheme="minorHAnsi" w:cstheme="minorHAnsi"/>
+                          <w:sz w:val="22"/>
+                          <w:szCs w:val="22"/>
+                        </w:rPr>
+                        <w:t>random cell search</w:t>
+                      </w:r>
+                      <w:r>
+                        <w:rPr>
+                          <w:rFonts w:asciiTheme="minorHAnsi" w:hAnsiTheme="minorHAnsi" w:cstheme="minorHAnsi"/>
+                          <w:sz w:val="22"/>
+                          <w:szCs w:val="22"/>
+                        </w:rPr>
+                        <w:t xml:space="preserve"> of B</w:t>
+                      </w:r>
+                      <w:r>
+                        <w:rPr>
+                          <w:rFonts w:asciiTheme="minorHAnsi" w:hAnsiTheme="minorHAnsi" w:cstheme="minorHAnsi"/>
+                          <w:sz w:val="22"/>
+                          <w:szCs w:val="22"/>
+                        </w:rPr>
+                        <w:t>1</w:t>
+                      </w:r>
+                      <w:r>
+                        <w:rPr>
+                          <w:rFonts w:asciiTheme="minorHAnsi" w:hAnsiTheme="minorHAnsi" w:cstheme="minorHAnsi"/>
+                          <w:sz w:val="22"/>
+                          <w:szCs w:val="22"/>
+                        </w:rPr>
+                        <w:t>-</w:t>
+                      </w:r>
+                      <w:r>
+                        <w:rPr>
+                          <w:rFonts w:asciiTheme="minorHAnsi" w:hAnsiTheme="minorHAnsi" w:cstheme="minorHAnsi"/>
+                          <w:sz w:val="22"/>
+                          <w:szCs w:val="22"/>
+                        </w:rPr>
+                        <w:t>202</w:t>
+                      </w:r>
+                      <w:r>
+                        <w:rPr>
+                          <w:rFonts w:asciiTheme="minorHAnsi" w:hAnsiTheme="minorHAnsi" w:cstheme="minorHAnsi"/>
+                          <w:sz w:val="22"/>
+                          <w:szCs w:val="22"/>
+                        </w:rPr>
+                        <w:t xml:space="preserve"> at approximately </w:t>
+                      </w:r>
+                      <w:r>
+                        <w:rPr>
+                          <w:rFonts w:asciiTheme="minorHAnsi" w:hAnsiTheme="minorHAnsi" w:cstheme="minorHAnsi"/>
+                          <w:sz w:val="22"/>
+                          <w:szCs w:val="22"/>
+                        </w:rPr>
+                        <w:t>1</w:t>
+                      </w:r>
+                      <w:r>
+                        <w:rPr>
+                          <w:rFonts w:asciiTheme="minorHAnsi" w:hAnsiTheme="minorHAnsi" w:cstheme="minorHAnsi"/>
+                          <w:sz w:val="22"/>
+                          <w:szCs w:val="22"/>
+                        </w:rPr>
+                        <w:t>:</w:t>
+                      </w:r>
+                      <w:r>
+                        <w:rPr>
+                          <w:rFonts w:asciiTheme="minorHAnsi" w:hAnsiTheme="minorHAnsi" w:cstheme="minorHAnsi"/>
+                          <w:sz w:val="22"/>
+                          <w:szCs w:val="22"/>
+                        </w:rPr>
+                        <w:t>0</w:t>
+                      </w:r>
+                      <w:r>
+                        <w:rPr>
+                          <w:rFonts w:asciiTheme="minorHAnsi" w:hAnsiTheme="minorHAnsi" w:cstheme="minorHAnsi"/>
+                          <w:sz w:val="22"/>
+                          <w:szCs w:val="22"/>
+                        </w:rPr>
+                        <w:t>0</w:t>
+                      </w:r>
+                      <w:r>
+                        <w:rPr>
+                          <w:rFonts w:asciiTheme="minorHAnsi" w:hAnsiTheme="minorHAnsi" w:cstheme="minorHAnsi"/>
+                          <w:sz w:val="22"/>
+                          <w:szCs w:val="22"/>
+                        </w:rPr>
+                        <w:t xml:space="preserve"> </w:t>
+                      </w:r>
+                      <w:r>
+                        <w:rPr>
+                          <w:rFonts w:asciiTheme="minorHAnsi" w:hAnsiTheme="minorHAnsi" w:cstheme="minorHAnsi"/>
+                          <w:sz w:val="22"/>
+                          <w:szCs w:val="22"/>
+                        </w:rPr>
+                        <w:t>p</w:t>
+                      </w:r>
+                      <w:r>
+                        <w:rPr>
+                          <w:rFonts w:asciiTheme="minorHAnsi" w:hAnsiTheme="minorHAnsi" w:cstheme="minorHAnsi"/>
+                          <w:sz w:val="22"/>
+                          <w:szCs w:val="22"/>
+                        </w:rPr>
+                        <w:t>m</w:t>
+                      </w:r>
+                      <w:r>
+                        <w:rPr>
+                          <w:rFonts w:asciiTheme="minorHAnsi" w:hAnsiTheme="minorHAnsi" w:cstheme="minorHAnsi"/>
+                          <w:sz w:val="22"/>
+                          <w:szCs w:val="22"/>
+                        </w:rPr>
+                        <w:t>.</w:t>
+                      </w:r>
+                      <w:r>
+                        <w:rPr>
+                          <w:rFonts w:asciiTheme="minorHAnsi" w:hAnsiTheme="minorHAnsi" w:cstheme="minorHAnsi"/>
+                          <w:sz w:val="22"/>
+                          <w:szCs w:val="22"/>
+                        </w:rPr>
+                        <w:t xml:space="preserve"> </w:t>
+                      </w:r>
+                      <w:r>
+                        <w:rPr>
+                          <w:rFonts w:asciiTheme="minorHAnsi" w:hAnsiTheme="minorHAnsi" w:cstheme="minorHAnsi"/>
+                          <w:sz w:val="22"/>
+                          <w:szCs w:val="22"/>
+                        </w:rPr>
+                        <w:t>I</w:t>
+                      </w:r>
+                      <w:r>
+                        <w:rPr>
+                          <w:rFonts w:asciiTheme="minorHAnsi" w:hAnsiTheme="minorHAnsi" w:cstheme="minorHAnsi"/>
+                          <w:sz w:val="22"/>
+                          <w:szCs w:val="22"/>
+                        </w:rPr>
+                        <w:t>nmate</w:t>
+                      </w:r>
+                      <w:r>
+                        <w:rPr>
+                          <w:color w:val="000000"/>
+                        </w:rPr>
+                        <w:t xml:space="preserve"> </w:t>
+                      </w:r>
+                      <w:r>
+                        <w:rPr>
+                          <w:color w:val="000000"/>
+                        </w:rPr>
+                        <w:t>C</w:t>
+                      </w:r>
+                      <w:r>
+                        <w:rPr>
+                          <w:color w:val="000000"/>
+                        </w:rPr>
+                        <w:t>ASSIDY, NICHOLAS</w:t>
+                      </w:r>
+                      <w:r>
+                        <w:rPr>
+                          <w:color w:val="000000"/>
+                        </w:rPr>
+                        <w:t xml:space="preserve"> </w:t>
+                      </w:r>
+                      <w:r>
+                        <w:rPr>
+                          <w:rFonts w:asciiTheme="minorHAnsi" w:hAnsiTheme="minorHAnsi" w:cstheme="minorHAnsi"/>
+                          <w:sz w:val="22"/>
+                          <w:szCs w:val="22"/>
+                        </w:rPr>
+                        <w:t xml:space="preserve">DC# </w:t>
+                      </w:r>
+                      <w:r>
+                        <w:rPr>
+                          <w:color w:val="000000"/>
+                        </w:rPr>
+                        <w:t>X89985</w:t>
+                      </w:r>
+                      <w:r>
+                        <w:rPr>
+                          <w:color w:val="000000"/>
+                        </w:rPr>
+                        <w:t xml:space="preserve"> </w:t>
+                      </w:r>
+                      <w:r>
+                        <w:rPr>
+                          <w:rFonts w:asciiTheme="minorHAnsi" w:hAnsiTheme="minorHAnsi" w:cstheme="minorHAnsi"/>
+                          <w:color w:val="000000"/>
+                        </w:rPr>
+                        <w:t>was</w:t>
+                      </w:r>
+                      <w:r>
+                        <w:rPr>
+                          <w:rFonts w:asciiTheme="minorHAnsi" w:hAnsiTheme="minorHAnsi" w:cstheme="minorHAnsi"/>
+                          <w:color w:val="000000"/>
+                        </w:rPr>
+                        <w:t xml:space="preserve"> in possession of</w:t>
+                      </w:r>
+                      <w:r>
+                        <w:rPr>
+                          <w:rFonts w:asciiTheme="minorHAnsi" w:hAnsiTheme="minorHAnsi" w:cstheme="minorHAnsi"/>
+                          <w:color w:val="000000"/>
+                        </w:rPr>
+                        <w:t xml:space="preserve"> multiple torn state clothing items</w:t>
+                      </w:r>
+                      <w:r>
+                        <w:rPr>
+                          <w:rFonts w:asciiTheme="minorHAnsi" w:hAnsiTheme="minorHAnsi" w:cstheme="minorHAnsi"/>
+                          <w:color w:val="000000"/>
+                        </w:rPr>
+                        <w:t xml:space="preserve"> as well as a </w:t>
+                      </w:r>
+                      <w:r>
+                        <w:rPr>
+                          <w:rFonts w:asciiTheme="minorHAnsi" w:hAnsiTheme="minorHAnsi" w:cstheme="minorHAnsi"/>
+                          <w:color w:val="000000"/>
+                        </w:rPr>
+                        <w:t xml:space="preserve">piece of </w:t>
+                      </w:r>
+                      <w:proofErr w:type="gramStart"/>
+                      <w:r>
+                        <w:rPr>
+                          <w:rFonts w:asciiTheme="minorHAnsi" w:hAnsiTheme="minorHAnsi" w:cstheme="minorHAnsi"/>
+                          <w:color w:val="000000"/>
+                        </w:rPr>
+                        <w:t>cardboard</w:t>
+                      </w:r>
+                      <w:r>
+                        <w:rPr>
+                          <w:rFonts w:asciiTheme="minorHAnsi" w:hAnsiTheme="minorHAnsi" w:cstheme="minorHAnsi"/>
+                          <w:color w:val="000000"/>
+                        </w:rPr>
+                        <w:t xml:space="preserve"> </w:t>
+                      </w:r>
+                      <w:r>
+                        <w:rPr>
+                          <w:rFonts w:asciiTheme="minorHAnsi" w:hAnsiTheme="minorHAnsi" w:cstheme="minorHAnsi"/>
+                          <w:color w:val="000000"/>
+                        </w:rPr>
+                        <w:t xml:space="preserve"> with</w:t>
+                      </w:r>
+                      <w:proofErr w:type="gramEnd"/>
+                      <w:r>
+                        <w:rPr>
+                          <w:rFonts w:asciiTheme="minorHAnsi" w:hAnsiTheme="minorHAnsi" w:cstheme="minorHAnsi"/>
+                          <w:color w:val="000000"/>
+                        </w:rPr>
+                        <w:t xml:space="preserve"> string tied around it used for </w:t>
+                      </w:r>
+                      <w:r>
+                        <w:rPr>
+                          <w:rFonts w:asciiTheme="minorHAnsi" w:hAnsiTheme="minorHAnsi" w:cstheme="minorHAnsi"/>
+                          <w:color w:val="000000"/>
+                        </w:rPr>
+                        <w:t>fishing.</w:t>
+                      </w:r>
+                      <w:r>
+                        <w:rPr>
+                          <w:rFonts w:asciiTheme="minorHAnsi" w:hAnsiTheme="minorHAnsi" w:cstheme="minorHAnsi"/>
+                          <w:sz w:val="22"/>
+                          <w:szCs w:val="22"/>
+                        </w:rPr>
+                        <w:t xml:space="preserve"> </w:t>
+                      </w:r>
+                      <w:r>
+                        <w:rPr>
+                          <w:rFonts w:asciiTheme="minorHAnsi" w:hAnsiTheme="minorHAnsi" w:cstheme="minorHAnsi"/>
+                          <w:sz w:val="22"/>
+                          <w:szCs w:val="22"/>
+                        </w:rPr>
+                        <w:t>Per</w:t>
+                      </w:r>
+                      <w:r>
+                        <w:rPr>
+                          <w:rFonts w:asciiTheme="minorHAnsi" w:hAnsiTheme="minorHAnsi" w:cstheme="minorHAnsi"/>
+                          <w:sz w:val="22"/>
+                          <w:szCs w:val="22"/>
+                        </w:rPr>
+                        <w:t xml:space="preserve"> FAC Chapter 33-602.220 and FAC chapter 33-602.222</w:t>
+                      </w:r>
+                      <w:r>
+                        <w:rPr>
+                          <w:rFonts w:asciiTheme="minorHAnsi" w:hAnsiTheme="minorHAnsi" w:cstheme="minorHAnsi"/>
+                          <w:sz w:val="22"/>
+                          <w:szCs w:val="22"/>
+                        </w:rPr>
+                        <w:t>,</w:t>
+                      </w:r>
+                      <w:r>
+                        <w:rPr>
+                          <w:rFonts w:asciiTheme="minorHAnsi" w:hAnsiTheme="minorHAnsi" w:cstheme="minorHAnsi"/>
+                          <w:sz w:val="22"/>
+                          <w:szCs w:val="22"/>
+                        </w:rPr>
+                        <w:t xml:space="preserve"> If items of clothing, bedding or property are removed in order to prevent the inmate from inflicting injury to him or herself or others, to prevent destruction of property or equipment, or to prevent the inmate from impeding security staff from accomplishing functions essential to the unit and institutional security, staff shall re-assess the need for continued restriction every 72 hours thereafter. The warden, based on this assessment, will make the final determination on the continued denial or return of the items. The items will be returned to the inmate when no further behavior or threat of behavior of the type leading to the restriction has occurred.</w:t>
+                      </w:r>
+                    </w:p>
+                    <w:p>
+                      <w:pPr>
+                        <w:rPr>
+                          <w:sz w:val="20"/>
+                        </w:rPr>
+                      </w:pPr>
+                    </w:p>
+                    <w:p>
+                      <w:pPr>
+                        <w:rPr>
+                          <w:sz w:val="20"/>
+                        </w:rPr>
+                      </w:pPr>
+                    </w:p>
+                    <w:p>
+                      <w:pPr>
+                        <w:rPr>
+                          <w:sz w:val="20"/>
+                        </w:rPr>
+                      </w:pPr>
+                    </w:p>
+                    <w:p/>
+                    <w:p/>
+                    <w:p/>
+                    <w:p/>
+                    <w:p/>
+                    <w:p/>
+                    <w:p/>
+                    <w:p/>
+                    <w:p/>
+                    <w:p/>
+                    <w:p/>
+                    <w:p/>
+                    <w:p/>
+                    <w:p/>
+                    <w:p/>
+                    <w:p/>
+                    <w:p/>
+                    <w:p/>
+                    <w:p/>
+                    <w:p/>
+                    <w:p/>
+                  </w:txbxContent>
+                </v:textbox>
+              </v:shape>
+            </w:pict>
+          </mc:Fallback>
+        </mc:AlternateContent>
+      </w:r>
+    </w:p>
+    <w:p>
+      <w:pPr>
+        <w:ind w:left="-810" w:right="-810"/>
+        <w:rPr>
+          <w:b/>
+        </w:rPr>
+      </w:pPr>
+    </w:p>
+    <w:p>
+      <w:pPr>
+        <w:ind w:left="-810" w:right="-810"/>
+        <w:rPr>
+          <w:b/>
+        </w:rPr>
+      </w:pPr>
+    </w:p>
+    <w:p>
+      <w:pPr>
+        <w:ind w:left="-810" w:right="-810"/>
+        <w:rPr>
+          <w:b/>
+        </w:rPr>
+      </w:pPr>
+    </w:p>
+    <w:p>
+      <w:pPr>
+        <w:ind w:left="-810" w:right="-810"/>
+        <w:rPr>
+          <w:b/>
+        </w:rPr>
+      </w:pPr>
+    </w:p>
+    <w:p>
+      <w:pPr>
+        <w:ind w:left="-810" w:right="-810"/>
+        <w:rPr>
+          <w:b/>
+          <w:sz w:val="16"/>
+        </w:rPr>
+      </w:pPr>
+    </w:p>
+    <w:p>
+      <w:pPr>
+        <w:ind w:left="-810" w:right="-810"/>
+        <w:rPr>
+          <w:b/>
+        </w:rPr>
+      </w:pPr>
+    </w:p>
+    <w:p>
+      <w:pPr>
+        <w:ind w:left="-810" w:right="-810"/>
+        <w:rPr>
+          <w:b/>
+        </w:rPr>
+      </w:pPr>
+    </w:p>
+    <w:p>
+      <w:pPr>
+        <w:ind w:left="-810" w:right="-810"/>
+        <w:rPr>
+          <w:b/>
+        </w:rPr>
+      </w:pPr>
+    </w:p>
+    <w:p>
+      <w:pPr>
+        <w:ind w:left="-810" w:right="-810"/>
+        <w:rPr>
+          <w:b/>
+        </w:rPr>
+      </w:pPr>
+    </w:p>
+    <w:p>
+      <w:pPr>
+        <w:ind w:left="-810" w:right="-810"/>
+        <w:rPr>
+          <w:b/>
+        </w:rPr>
+      </w:pPr>
+    </w:p>
+    <w:p>
+      <w:pPr>
+        <w:ind w:left="-810" w:right="-810"/>
+        <w:rPr>
+          <w:b/>
+        </w:rPr>
+      </w:pPr>
+    </w:p>
+    <w:p>
+      <w:pPr>
+        <w:ind w:left="-810" w:right="-810"/>
+        <w:rPr>
+          <w:b/>
+        </w:rPr>
+      </w:pPr>
+    </w:p>
+    <w:p>
+      <w:pPr>
+        <w:ind w:left="-810" w:right="-810"/>
+        <w:rPr>
+          <w:b/>
+        </w:rPr>
+      </w:pPr>
+      <w:r>
+        <w:rPr>
+          <w:b/>
+        </w:rPr>
+        <w:t xml:space="preserve">Restrictions: {{restrictions}}</w:t>
+      </w:r>
+    </w:p>
+    <w:tbl>
+      <w:tblPr>
+        <w:tblStyle w:val="TableGrid"/>
+        <w:tblW w:w="10260" w:type="dxa"/>
+        <w:tblInd w:w="-702" w:type="dxa"/>
+        <w:tblLook w:val="04A0" w:firstRow="1" w:lastRow="0" w:firstColumn="1" w:lastColumn="0" w:noHBand="0" w:noVBand="1"/>
+      </w:tblPr>
+      <w:tblGrid>
+        <w:gridCol w:w="5040"/>
+        <w:gridCol w:w="270"/>
+        <w:gridCol w:w="1980"/>
+        <w:gridCol w:w="540"/>
+        <w:gridCol w:w="1080"/>
+        <w:gridCol w:w="90"/>
+        <w:gridCol w:w="180"/>
+        <w:gridCol w:w="1080"/>
+      </w:tblGrid>
+      <w:tr>
+        <w:trPr>
+          <w:trHeight w:val="432"/>
+        </w:trPr>
+        <w:tc>
+          <w:tcPr>
+            <w:tcW w:w="5040" w:type="dxa"/>
+            <w:tcBorders>
+              <w:top w:val="nil"/>
+              <w:left w:val="nil"/>
+              <w:bottom w:val="single" w:sz="4" w:space="0" w:color="auto"/>
+              <w:right w:val="nil"/>
+            </w:tcBorders>
+            <w:vAlign w:val="bottom"/>
+          </w:tcPr>
+          <w:p>
+            <w:pPr>
+              <w:ind w:right="-810"/>
+            </w:pPr>
+          </w:p>
+          <w:p>
+            <w:pPr>
+              <w:ind w:right="-810"/>
+            </w:pPr>
+          </w:p>
+          <w:p>
+            <w:pPr>
+              <w:ind w:right="-810"/>
+            </w:pPr>
+            <w:r>
+              <w:rPr>
+                <w:b/>
+                <w:noProof/>
+              </w:rPr>
+              <mc:AlternateContent>
+                <mc:Choice Requires="wps">
+                  <w:drawing>
+                    <wp:anchor distT="0" distB="0" distL="114300" distR="114300" simplePos="0" relativeHeight="251661312" behindDoc="0" locked="0" layoutInCell="1" allowOverlap="1" wp14:anchorId="589C343A" wp14:editId="66C5D7BF">
+                      <wp:simplePos x="0" y="0"/>
+                      <wp:positionH relativeFrom="column">
+                        <wp:posOffset>-9525</wp:posOffset>
+                      </wp:positionH>
+                      <wp:positionV relativeFrom="paragraph">
+                        <wp:posOffset>3175</wp:posOffset>
+                      </wp:positionV>
+                      <wp:extent cx="6515100" cy="617855"/>
+                      <wp:effectExtent l="0" t="0" r="0" b="0"/>
+                      <wp:wrapNone/>
+                      <wp:docPr id="1" name="Text Box 4"/>
+                      <wp:cNvGraphicFramePr>
+                        <a:graphicFrameLocks xmlns:a="http://schemas.openxmlformats.org/drawingml/2006/main"/>
+                      </wp:cNvGraphicFramePr>
+                      <a:graphic xmlns:a="http://schemas.openxmlformats.org/drawingml/2006/main">
+                        <a:graphicData uri="http://schemas.microsoft.com/office/word/2010/wordprocessingShape">
+                          <wps:wsp>
+                            <wps:cNvSpPr txBox="1">
+                              <a:spLocks noChangeArrowheads="1"/>
+                            </wps:cNvSpPr>
+                            <wps:spPr bwMode="auto">
+                              <a:xfrm>
+                                <a:off x="0" y="0"/>
+                                <a:ext cx="6515100" cy="617855"/>
+                              </a:xfrm>
+                              <a:prstGeom prst="rect">
+                                <a:avLst/>
+                              </a:prstGeom>
+                              <a:noFill/>
+                              <a:ln w="6350">
+                                <a:solidFill>
+                                  <a:srgbClr val="000000"/>
+                                </a:solidFill>
+                                <a:miter lim="800000"/>
+                                <a:headEnd/>
+                                <a:tailEnd/>
+                              </a:ln>
+                            </wps:spPr>
+                            <wps:txbx>
+                              <w:txbxContent>
+                                <w:p>
+                                  <w:pPr>
+                                    <w:rPr>
+                                      <w:sz w:val="20"/>
+                                    </w:rPr>
+                                  </w:pPr>
+                                  <w:r>
+                                    <w:rPr>
+                                      <w:sz w:val="20"/>
+                                    </w:rPr>
+                                    <w:t>{{restrictionsDetail}}</w:t>
+                                  </w:r>
+                                </w:p>
+                                <w:p>
+                                  <w:pPr>
+                                    <w:rPr>
+                                      <w:sz w:val="20"/>
+                                    </w:rPr>
+                                  </w:pPr>
+                                  <w:r>
+                                    <w:rPr>
+                                      <w:sz w:val="20"/>
+                                    </w:rPr>
+                                    <w:t>Mattress:</w:t>
+                                  </w:r>
+                                  <w:r>
+                                    <w:rPr>
+                                      <w:sz w:val="20"/>
+                                    </w:rPr>
+                                    <w:t xml:space="preserve">	{{mattressLine}}</w:t>
+                                  </w:r>
+                                </w:p>
+                                <w:p>
+                                  <w:pPr>
+                                    <w:rPr>
+                                      <w:sz w:val="20"/>
+                                    </w:rPr>
+                                  </w:pPr>
+                                  <w:r>
+                                    <w:rPr>
+                                      <w:sz w:val="20"/>
+                                    </w:rPr>
+                                    <w:t>Bedding/Linens</w:t>
+                                  </w:r>
+                                  <w:r>
+                                    <w:rPr>
+                                      <w:sz w:val="20"/>
+                                    </w:rPr>
+                                    <w:t xml:space="preserve">	{{beddingLine}}</w:t>
+                                  </w:r>
+                                  <w:proofErr w:type="spellEnd"/>
+                                  <w:r>
+                                    <w:rPr>
+                                      <w:sz w:val="20"/>
+                                    </w:rPr>
+                                    <w:t>______</w:t>
+                                  </w:r>
+                                </w:p>
+                                <w:p>
+                                  <w:pPr>
+                                    <w:rPr>
+                                      <w:sz w:val="20"/>
+                                    </w:rPr>
+                                  </w:pPr>
+                                </w:p>
+                                <w:p>
+                                  <w:pPr>
+                                    <w:rPr>
+                                      <w:sz w:val="20"/>
+                                    </w:rPr>
+                                  </w:pPr>
+                                </w:p>
+                                <w:p>
+                                  <w:pPr>
+                                    <w:rPr>
+                                      <w:sz w:val="20"/>
+                                    </w:rPr>
+                                  </w:pPr>
+                                </w:p>
+                                <w:p>
+                                  <w:pPr>
+                                    <w:rPr>
+                                      <w:sz w:val="20"/>
+                                    </w:rPr>
+                                  </w:pPr>
+                                </w:p>
+                                <w:p>
+                                  <w:pPr>
+                                    <w:rPr>
+                                      <w:sz w:val="20"/>
+                                    </w:rPr>
+                                  </w:pPr>
+                                </w:p>
+                                <w:p>
+                                  <w:pPr>
+                                    <w:rPr>
+                                      <w:sz w:val="20"/>
+                                    </w:rPr>
+                                  </w:pPr>
+                                </w:p>
+                                <w:p>
+                                  <w:pPr>
+                                    <w:rPr>
+                                      <w:sz w:val="20"/>
+                                    </w:rPr>
+                                  </w:pPr>
+                                </w:p>
+                                <w:p>
+                                  <w:pPr>
+                                    <w:rPr>
+                                      <w:sz w:val="20"/>
+                                    </w:rPr>
+                                  </w:pPr>
+                                </w:p>
+                                <w:p/>
+                                <w:p/>
+                                <w:p/>
+                                <w:p/>
+                                <w:p/>
+                                <w:p/>
+                                <w:p/>
+                                <w:p/>
+                                <w:p/>
+                                <w:p/>
+                                <w:p/>
+                                <w:p/>
+                                <w:p/>
+                                <w:p/>
+                              </w:txbxContent>
+                            </wps:txbx>
+                            <wps:bodyPr rot="0" vert="horz" wrap="square" lIns="91440" tIns="45720" rIns="91440" bIns="45720" anchor="t" anchorCtr="0" upright="1">
+                              <a:noAutofit/>
+                            </wps:bodyPr>
+                          </wps:wsp>
+                        </a:graphicData>
+                      </a:graphic>
+                      <wp14:sizeRelH relativeFrom="page">
+                        <wp14:pctWidth>0</wp14:pctWidth>
+                      </wp14:sizeRelH>
+                      <wp14:sizeRelV relativeFrom="margin">
+                        <wp14:pctHeight>0</wp14:pctHeight>
+                      </wp14:sizeRelV>
+                    </wp:anchor>
+                  </w:drawing>
+                </mc:Choice>
+                <mc:Fallback>
+                  <w:pict>
+                    <v:shape w14:anchorId="589C343A" id="Text Box 4" o:spid="_x0000_s1027" type="#_x0000_t202" style="position:absolute;margin-left:-.75pt;margin-top:.25pt;width:513pt;height:48.65pt;z-index:251661312;visibility:visible;mso-wrap-style:square;mso-width-percent:0;mso-height-percent:0;mso-wrap-distance-left:9pt;mso-wrap-distance-top:0;mso-wrap-distance-right:9pt;mso-wrap-distance-bottom:0;mso-position-horizontal:absolute;mso-position-horizontal-relative:text;mso-position-vertical:absolute;mso-position-vertical-relative:text;mso-width-percent:0;mso-height-percent:0;mso-width-relative:page;mso-height-relative:margin;v-text-anchor:top" o:gfxdata="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" filled="f" strokeweight=".5pt">
+                      <v:textbox>
+                        <w:txbxContent>
+                          <w:p>
+                            <w:pPr>
+                              <w:rPr>
+                                <w:sz w:val="20"/>
+                              </w:rPr>
+                            </w:pPr>
+                            <w:r>
+                              <w:rPr>
+                                <w:sz w:val="20"/>
+                              </w:rPr>
+                              <w:t xml:space="preserve">All state issued clothing and all his personal property. Inmate will be allowed to retain the following </w:t>
+                            </w:r>
+                            <w:proofErr w:type="gramStart"/>
+                            <w:r>
+                              <w:rPr>
+                                <w:sz w:val="20"/>
+                              </w:rPr>
+                              <w:t>items</w:t>
+                            </w:r>
+                            <w:proofErr w:type="gramEnd"/>
+                          </w:p>
+                          <w:p>
+                            <w:pPr>
+                              <w:rPr>
+                                <w:sz w:val="20"/>
+                              </w:rPr>
+                            </w:pPr>
+                            <w:r>
+                              <w:rPr>
+                                <w:sz w:val="20"/>
+                              </w:rPr>
+                              <w:t>Mattress:</w:t>
+                            </w:r>
+                            <w:r>
+                              <w:rPr>
+                                <w:sz w:val="20"/>
+                              </w:rPr>
+                              <w:tab/>
+                              <w:t xml:space="preserve">Yes_________   </w:t>
+                            </w:r>
+                            <w:proofErr w:type="spellStart"/>
+                            <w:r>
+                              <w:rPr>
+                                <w:sz w:val="20"/>
+                              </w:rPr>
+                              <w:t>No____</w:t>
+                            </w:r>
+                            <w:r>
+                              <w:rPr>
+                                <w:sz w:val="20"/>
+                                <w:u w:val="single"/>
+                              </w:rPr>
+                              <w:t>X</w:t>
+                            </w:r>
+                            <w:proofErr w:type="spellEnd"/>
+                            <w:r>
+                              <w:rPr>
+                                <w:sz w:val="20"/>
+                              </w:rPr>
+                              <w:t>_______</w:t>
+                            </w:r>
+                          </w:p>
+                          <w:p>
+                            <w:pPr>
+                              <w:rPr>
+                                <w:sz w:val="20"/>
+                              </w:rPr>
+                            </w:pPr>
+                            <w:r>
+                              <w:rPr>
+                                <w:sz w:val="20"/>
+                              </w:rPr>
+                              <w:t>Bedding/Linens</w:t>
+                            </w:r>
+                            <w:r>
+                              <w:rPr>
+                                <w:sz w:val="20"/>
+                              </w:rPr>
+                              <w:t xml:space="preserve">	{{beddingLine}}</w:t>
+                            </w:r>
+                            <w:proofErr w:type="spellEnd"/>
+                            <w:r>
+                              <w:rPr>
+                                <w:sz w:val="20"/>
+                              </w:rPr>
+                              <w:t>______</w:t>
+                            </w:r>
+                          </w:p>
+                          <w:p>
+                            <w:pPr>
+                              <w:rPr>
+                                <w:sz w:val="20"/>
+                              </w:rPr>
+                            </w:pPr>
+                          </w:p>
+                          <w:p>
+                            <w:pPr>
+                              <w:rPr>
+                                <w:sz w:val="20"/>
+                              </w:rPr>
+                            </w:pPr>
+                          </w:p>
+                          <w:p>
+                            <w:pPr>
+                              <w:rPr>
+                                <w:sz w:val="20"/>
+                              </w:rPr>
+                            </w:pPr>
+                          </w:p>
+                          <w:p>
+                            <w:pPr>
+                              <w:rPr>
+                                <w:sz w:val="20"/>
+                              </w:rPr>
+                            </w:pPr>
+                          </w:p>
+                          <w:p>
+                            <w:pPr>
+                              <w:rPr>
+                                <w:sz w:val="20"/>
+                              </w:rPr>
+                            </w:pPr>
+                          </w:p>
+                          <w:p>
+                            <w:pPr>
+                              <w:rPr>
+                                <w:sz w:val="20"/>
+                              </w:rPr>
+                            </w:pPr>
+                          </w:p>
+                          <w:p>
+                            <w:pPr>
+                              <w:rPr>
+                                <w:sz w:val="20"/>
+                              </w:rPr>
+                            </w:pPr>
+                          </w:p>
+                          <w:p>
+                            <w:pPr>
+                              <w:rPr>
+                                <w:sz w:val="20"/>
+                              </w:rPr>
+                            </w:pPr>
+                          </w:p>
+                          <w:p/>
+                          <w:p/>
+                          <w:p/>
+                          <w:p/>
+                          <w:p/>
+                          <w:p/>
+                          <w:p/>
+                          <w:p/>
+                          <w:p/>
+                          <w:p/>
+                          <w:p/>
+                          <w:p/>
+                          <w:p/>
+                          <w:p/>
+                        </w:txbxContent>
+                      </v:textbox>
+                    </v:shape>
+                  </w:pict>
+                </mc:Fallback>
+              </mc:AlternateContent>
+            </w:r>
+          </w:p>
+          <w:p>
+            <w:pPr>
+              <w:ind w:right="-810"/>
+            </w:pPr>
+          </w:p>
+          <w:p>
+            <w:pPr>
+              <w:ind w:right="-810"/>
+            </w:pPr>
+          </w:p>
+          <w:p>
+            <w:pPr>
+              <w:ind w:right="-810"/>
+            </w:pPr>
+          </w:p>
+          <w:p>
+            <w:pPr>
+              <w:ind w:right="-810"/>
+            </w:pPr>
+            <w:r>
+              <w:t>{{supervisorName}}</w:t>
+            </w:r>
+          </w:p>
+        </w:tc>
+        <w:tc>
+          <w:tcPr>
+            <w:tcW w:w="270" w:type="dxa"/>
+            <w:tcBorders>
+              <w:top w:val="nil"/>
+              <w:left w:val="nil"/>
+              <w:bottom w:val="nil"/>
+              <w:right w:val="nil"/>
+            </w:tcBorders>
+            <w:vAlign w:val="bottom"/>
+          </w:tcPr>
+          <w:p>
+            <w:pPr>
+              <w:ind w:right="-810"/>
+            </w:pPr>
+          </w:p>
+        </w:tc>
+        <w:tc>
+          <w:tcPr>
+            <w:tcW w:w="1980" w:type="dxa"/>
+            <w:tcBorders>
+              <w:top w:val="nil"/>
+              <w:left w:val="nil"/>
+              <w:bottom w:val="single" w:sz="4" w:space="0" w:color="auto"/>
+              <w:right w:val="nil"/>
+            </w:tcBorders>
+            <w:vAlign w:val="bottom"/>
+          </w:tcPr>
+          <w:p>
+            <w:pPr>
+              <w:ind w:right="-810"/>
+            </w:pPr>
+            <w:r>
+              <w:t>{{supervisorDate}}</w:t>
+            </w:r>
+          </w:p>
+        </w:tc>
+        <w:tc>
+          <w:tcPr>
+            <w:tcW w:w="2970" w:type="dxa"/>
+            <w:gridSpan w:val="5"/>
+            <w:tcBorders>
+              <w:top w:val="nil"/>
+              <w:left w:val="nil"/>
+              <w:bottom w:val="nil"/>
+              <w:right w:val="nil"/>
+            </w:tcBorders>
+            <w:vAlign w:val="bottom"/>
+          </w:tcPr>
+          <w:p>
+            <w:pPr>
+              <w:ind w:right="-810"/>
+            </w:pPr>
+          </w:p>
+        </w:tc>
+      </w:tr>
+      <w:tr>
+        <w:trPr>
+          <w:trHeight w:val="216"/>
+        </w:trPr>
+        <w:tc>
+          <w:tcPr>
+            <w:tcW w:w="5310" w:type="dxa"/>
+            <w:gridSpan w:val="2"/>
+            <w:tcBorders>
+              <w:top w:val="nil"/>
+              <w:left w:val="nil"/>
+              <w:bottom w:val="nil"/>
+              <w:right w:val="nil"/>
+            </w:tcBorders>
+            <w:vAlign w:val="bottom"/>
+          </w:tcPr>
+          <w:p>
+            <w:pPr>
+              <w:ind w:right="-810"/>
+              <w:rPr>
+                <w:sz w:val="20"/>
+              </w:rPr>
+            </w:pPr>
+            <w:r>
+              <w:rPr>
+                <w:sz w:val="20"/>
+              </w:rPr>
+              <w:t>Shift Supervisor</w:t>
+            </w:r>
+          </w:p>
+        </w:tc>
+        <w:tc>
+          <w:tcPr>
+            <w:tcW w:w="4950" w:type="dxa"/>
+            <w:gridSpan w:val="6"/>
+            <w:tcBorders>
+              <w:top w:val="nil"/>
+              <w:left w:val="nil"/>
+              <w:bottom w:val="nil"/>
+              <w:right w:val="nil"/>
+            </w:tcBorders>
+            <w:vAlign w:val="bottom"/>
+          </w:tcPr>
+          <w:p>
+            <w:pPr>
+              <w:ind w:right="-810"/>
+              <w:rPr>
+                <w:sz w:val="20"/>
+              </w:rPr>
+            </w:pPr>
+            <w:r>
+              <w:rPr>
+                <w:sz w:val="20"/>
+              </w:rPr>
+              <w:t>Date</w:t>
+            </w:r>
+          </w:p>
+        </w:tc>
+      </w:tr>
+      <w:tr>
+        <w:trPr>
+          <w:trHeight w:val="432"/>
+        </w:trPr>
+        <w:tc>
+          <w:tcPr>
+            <w:tcW w:w="5040" w:type="dxa"/>
+            <w:tcBorders>
+              <w:top w:val="nil"/>
+              <w:left w:val="nil"/>
+              <w:bottom w:val="single" w:sz="4" w:space="0" w:color="auto"/>
+              <w:right w:val="nil"/>
+            </w:tcBorders>
+            <w:vAlign w:val="bottom"/>
+          </w:tcPr>
+          <w:p>
+            <w:pPr>
+              <w:ind w:right="-810"/>
+            </w:pPr>
+            <w:r>
+              <w:t>{{chiefName}}</w:t>
+            </w:r>
+          </w:p>
+        </w:tc>
+        <w:tc>
+          <w:tcPr>
+            <w:tcW w:w="270" w:type="dxa"/>
+            <w:tcBorders>
+              <w:top w:val="nil"/>
+              <w:left w:val="nil"/>
+              <w:bottom w:val="nil"/>
+              <w:right w:val="nil"/>
+            </w:tcBorders>
+            <w:vAlign w:val="bottom"/>
+          </w:tcPr>
+          <w:p>
+            <w:pPr>
+              <w:ind w:right="-810"/>
+            </w:pPr>
+          </w:p>
+        </w:tc>
+        <w:tc>
+          <w:tcPr>
+            <w:tcW w:w="1980" w:type="dxa"/>
+            <w:tcBorders>
+              <w:top w:val="nil"/>
+              <w:left w:val="nil"/>
+              <w:bottom w:val="single" w:sz="4" w:space="0" w:color="auto"/>
+              <w:right w:val="nil"/>
+            </w:tcBorders>
+            <w:vAlign w:val="bottom"/>
+          </w:tcPr>
+          <w:p>
+            <w:pPr>
+              <w:ind w:right="-810"/>
+            </w:pPr>
+            <w:r>
+              <w:t>{{chiefDate}}</w:t>
+            </w:r>
+          </w:p>
+        </w:tc>
+        <w:tc>
+          <w:tcPr>
+            <w:tcW w:w="540" w:type="dxa"/>
+            <w:tcBorders>
+              <w:top w:val="nil"/>
+              <w:left w:val="nil"/>
+              <w:bottom w:val="nil"/>
+              <w:right w:val="nil"/>
+            </w:tcBorders>
+            <w:vAlign w:val="bottom"/>
+          </w:tcPr>
+          <w:p>
+            <w:pPr>
+              <w:ind w:right="-810"/>
+            </w:pPr>
+          </w:p>
+        </w:tc>
+        <w:tc>
+          <w:tcPr>
+            <w:tcW w:w="1080" w:type="dxa"/>
+            <w:tcBorders>
+              <w:top w:val="nil"/>
+              <w:left w:val="nil"/>
+              <w:bottom w:val="single" w:sz="4" w:space="0" w:color="auto"/>
+              <w:right w:val="nil"/>
+            </w:tcBorders>
+            <w:vAlign w:val="bottom"/>
+          </w:tcPr>
+          <w:p>
+            <w:pPr>
+              <w:ind w:right="-810"/>
+            </w:pPr>
+            <w:r>
+              <w:t xml:space="preserve">{{approvalX}}</w:t>
+            </w:r>
+          </w:p>
+        </w:tc>
+        <w:tc>
+          <w:tcPr>
+            <w:tcW w:w="270" w:type="dxa"/>
+            <w:gridSpan w:val="2"/>
+            <w:tcBorders>
+              <w:top w:val="nil"/>
+              <w:left w:val="nil"/>
+              <w:bottom w:val="nil"/>
+              <w:right w:val="nil"/>
+            </w:tcBorders>
+            <w:vAlign w:val="bottom"/>
+          </w:tcPr>
+          <w:p>
+            <w:pPr>
+              <w:ind w:right="-810"/>
+            </w:pPr>
+          </w:p>
+        </w:tc>
+        <w:tc>
+          <w:tcPr>
+            <w:tcW w:w="1080" w:type="dxa"/>
+            <w:tcBorders>
+              <w:top w:val="nil"/>
+              <w:left w:val="nil"/>
+              <w:bottom w:val="single" w:sz="4" w:space="0" w:color="auto"/>
+              <w:right w:val="nil"/>
+            </w:tcBorders>
+            <w:vAlign w:val="bottom"/>
+          </w:tcPr>
+          <w:p>
+            <w:pPr>
+              <w:ind w:right="-810"/>
+            </w:pPr>
+            <w:r>
+              <w:t xml:space="preserve">  </w:t>
+            </w:r>
+          </w:p>
+        </w:tc>
+      </w:tr>
+      <w:tr>
+        <w:trPr>
+          <w:trHeight w:val="216"/>
+        </w:trPr>
+        <w:tc>
+          <w:tcPr>
+            <w:tcW w:w="5310" w:type="dxa"/>
+            <w:gridSpan w:val="2"/>
+            <w:tcBorders>
+              <w:top w:val="nil"/>
+              <w:left w:val="nil"/>
+              <w:bottom w:val="nil"/>
+              <w:right w:val="nil"/>
+            </w:tcBorders>
+            <w:vAlign w:val="bottom"/>
+          </w:tcPr>
+          <w:p>
+            <w:pPr>
+              <w:ind w:right="-810"/>
+              <w:rPr>
+                <w:sz w:val="20"/>
+              </w:rPr>
+            </w:pPr>
+            <w:r>
+              <w:rPr>
+                <w:sz w:val="20"/>
+              </w:rPr>
+              <w:t>Correctional Officer Chief</w:t>
+            </w:r>
+          </w:p>
+        </w:tc>
+        <w:tc>
+          <w:tcPr>
+            <w:tcW w:w="2520" w:type="dxa"/>
+            <w:gridSpan w:val="2"/>
+            <w:tcBorders>
+              <w:top w:val="nil"/>
+              <w:left w:val="nil"/>
+              <w:bottom w:val="nil"/>
+              <w:right w:val="nil"/>
+            </w:tcBorders>
+            <w:vAlign w:val="bottom"/>
+          </w:tcPr>
+          <w:p>
+            <w:pPr>
+              <w:ind w:right="-810"/>
+              <w:rPr>
+                <w:sz w:val="20"/>
+              </w:rPr>
+            </w:pPr>
+            <w:r>
+              <w:rPr>
+                <w:sz w:val="20"/>
+              </w:rPr>
+              <w:t>Date</w:t>
+            </w:r>
+          </w:p>
+        </w:tc>
+        <w:tc>
+          <w:tcPr>
+            <w:tcW w:w="1170" w:type="dxa"/>
+            <w:gridSpan w:val="2"/>
+            <w:tcBorders>
+              <w:top w:val="nil"/>
+              <w:left w:val="nil"/>
+              <w:bottom w:val="nil"/>
+              <w:right w:val="nil"/>
+            </w:tcBorders>
+            <w:tcMar>
+              <w:left w:w="0" w:type="dxa"/>
+              <w:right w:w="115" w:type="dxa"/>
+            </w:tcMar>
+            <w:vAlign w:val="bottom"/>
+          </w:tcPr>
+          <w:p>
+            <w:pPr>
+              <w:ind w:right="-810"/>
+              <w:rPr>
+                <w:sz w:val="20"/>
+              </w:rPr>
+            </w:pPr>
+            <w:r>
+              <w:rPr>
+                <w:sz w:val="20"/>
+              </w:rPr>
+              <w:t xml:space="preserve"> </w:t>
+            </w:r>
+            <w:r>
+              <w:rPr>
+                <w:sz w:val="20"/>
+              </w:rPr>
+              <w:t xml:space="preserve"> </w:t>
+            </w:r>
+            <w:r>
+              <w:rPr>
+                <w:sz w:val="20"/>
+              </w:rPr>
+              <w:t>Approved</w:t>
+            </w:r>
+          </w:p>
+        </w:tc>
+        <w:tc>
+          <w:tcPr>
+            <w:tcW w:w="1260" w:type="dxa"/>
+            <w:gridSpan w:val="2"/>
+            <w:tcBorders>
+              <w:top w:val="nil"/>
+              <w:left w:val="nil"/>
+              <w:bottom w:val="nil"/>
+              <w:right w:val="nil"/>
+            </w:tcBorders>
+            <w:vAlign w:val="bottom"/>
+          </w:tcPr>
+          <w:p>
+            <w:pPr>
+              <w:ind w:right="-810"/>
+              <w:rPr>
+                <w:sz w:val="20"/>
+              </w:rPr>
+            </w:pPr>
+            <w:r>
+              <w:rPr>
+                <w:sz w:val="20"/>
+              </w:rPr>
+              <w:t xml:space="preserve">    </w:t>
+            </w:r>
+            <w:r>
+              <w:rPr>
+                <w:sz w:val="20"/>
+              </w:rPr>
+              <w:t xml:space="preserve">  </w:t>
+            </w:r>
+            <w:r>
+              <w:rPr>
+                <w:sz w:val="20"/>
+              </w:rPr>
+              <w:t>Denied</w:t>
+            </w:r>
+          </w:p>
+        </w:tc>
+      </w:tr>
+    </w:tbl>
+    <w:p>
+      <w:pPr>
+        <w:ind w:left="-810" w:right="-810"/>
+        <w:rPr>
+          <w:b/>
+          <w:sz w:val="16"/>
+        </w:rPr>
+      </w:pPr>
+    </w:p>
+    <w:p>
+      <w:pPr>
+        <w:ind w:left="-810" w:right="-810"/>
+      </w:pPr>
+      <w:r>
+        <w:t>Comments:</w:t>
+      </w:r>
+    </w:p>
+    <w:p>
+      <w:pPr>
+        <w:ind w:left="-810" w:right="-810"/>
+      </w:pPr>
+      <w:r>
+        <w:rPr>
+          <w:noProof/>
+        </w:rPr>
+        <mc:AlternateContent>
+          <mc:Choice Requires="wps">
+            <w:drawing>
+              <wp:anchor distT="0" distB="0" distL="114300" distR="114300" simplePos="0" relativeHeight="251663360" behindDoc="0" locked="0" layoutInCell="1" allowOverlap="1" wp14:anchorId="7B8C6936" wp14:editId="0E2BA18C">
+                <wp:simplePos x="0" y="0"/>
+                <wp:positionH relativeFrom="column">
+                  <wp:posOffset>-523875</wp:posOffset>
+                </wp:positionH>
+                <wp:positionV relativeFrom="paragraph">
+                  <wp:posOffset>10795</wp:posOffset>
+                </wp:positionV>
+                <wp:extent cx="6515100" cy="419100"/>
+                <wp:effectExtent l="0" t="0" r="0" b="0"/>
+                <wp:wrapNone/>
+                <wp:docPr id="5" name="Text Box 5"/>
+                <wp:cNvGraphicFramePr>
+                  <a:graphicFrameLocks xmlns:a="http://schemas.openxmlformats.org/drawingml/2006/main"/>
+                </wp:cNvGraphicFramePr>
+                <a:graphic xmlns:a="http://schemas.openxmlformats.org/drawingml/2006/main">
+                  <a:graphicData uri="http://schemas.microsoft.com/office/word/2010/wordprocessingShape">
+                    <wps:wsp>
+                      <wps:cNvSpPr txBox="1">
+                        <a:spLocks/>
+                      </wps:cNvSpPr>
+                      <wps:spPr>
+                        <a:xfrm>
+                          <a:off x="0" y="0"/>
+                          <a:ext cx="6515100" cy="419100"/>
+                        </a:xfrm>
+                        <a:prstGeom prst="rect">
+                          <a:avLst/>
+                        </a:prstGeom>
+                        <a:solidFill>
+                          <a:sysClr val="window" lastClr="FFFFFF"/>
+                        </a:solidFill>
+                        <a:ln w="6350">
+                          <a:solidFill>
+                            <a:prstClr val="black"/>
+                          </a:solidFill>
+                        </a:ln>
+                        <a:effectLst/>
+                      </wps:spPr>
+                      <wps:txbx>
+                        <w:txbxContent>
+                          <w:p>
+                            <w:r>
+                              <w:t xml:space="preserve">{{comments}}</w:t>
+                            </w:r>
+                          </w:p>
+                        </w:txbxContent>
+                      </wps:txbx>
+                      <wps:bodyPr rot="0" spcFirstLastPara="0" vertOverflow="overflow" horzOverflow="overflow" vert="horz" wrap="square" lIns="91440" tIns="45720" rIns="91440" bIns="45720" numCol="1" spcCol="0" rtlCol="0" fromWordArt="0" anchor="t" anchorCtr="0" forceAA="0" compatLnSpc="1">
+                        <a:prstTxWarp prst="textNoShape">
+                          <a:avLst/>
+                        </a:prstTxWarp>
+                        <a:noAutofit/>
+                      </wps:bodyPr>
+                    </wps:wsp>
+                  </a:graphicData>
+                </a:graphic>
+                <wp14:sizeRelH relativeFrom="page">
+                  <wp14:pctWidth>0</wp14:pctWidth>
+                </wp14:sizeRelH>
+                <wp14:sizeRelV relativeFrom="margin">
+                  <wp14:pctHeight>0</wp14:pctHeight>
+                </wp14:sizeRelV>
+              </wp:anchor>
+            </w:drawing>
+          </mc:Choice>
+          <mc:Fallback>
+            <w:pict>
+              <v:shape w14:anchorId="7B8C6936" id="Text Box 5" o:spid="_x0000_s1028" type="#_x0000_t202" style="position:absolute;left:0;text-align:left;margin-left:-41.25pt;margin-top:.85pt;width:513pt;height:33pt;z-index:251663360;visibility:visible;mso-wrap-style:square;mso-width-percent:0;mso-height-percent:0;mso-wrap-distance-left:9pt;mso-wrap-distance-top:0;mso-wrap-distance-right:9pt;mso-wrap-distance-bottom:0;mso-position-horizontal:absolute;mso-position-horizontal-relative:text;mso-position-vertical:absolute;mso-position-vertical-relative:text;mso-width-percent:0;mso-height-percent:0;mso-width-relative:page;mso-height-relative:margin;v-text-anchor:top" o:gfxdata="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" fillcolor="window" strokeweight=".5pt">
+                <v:path arrowok="t"/>
+                <v:textbox>
+                  <w:txbxContent>
+                    <w:p>
+                      <w:pPr>
+                        <w:rPr>
+                          <w:sz w:val="20"/>
+                        </w:rPr>
+                      </w:pPr>
+                    </w:p>
+                    <w:p/>
+                    <w:p/>
+                    <w:p/>
+                    <w:p/>
+                    <w:p/>
+                    <w:p/>
+                    <w:p/>
+                    <w:p/>
+                    <w:p/>
+                    <w:p/>
+                    <w:p/>
+                    <w:p/>
+                    <w:p/>
+                    <w:p/>
+                    <w:p/>
+                    <w:p/>
+                  </w:txbxContent>
+                </v:textbox>
+              </v:shape>
+            </w:pict>
+          </mc:Fallback>
+        </mc:AlternateContent>
+      </w:r>
+    </w:p>
+    <w:p>
+      <w:pPr>
+        <w:ind w:left="-810" w:right="-810"/>
+      </w:pPr>
+    </w:p>
+    <w:p>
+      <w:pPr>
+        <w:ind w:left="-810" w:right="-810"/>
+      </w:pPr>
+    </w:p>
+    <w:p>
+      <w:pPr>
+        <w:ind w:left="-810" w:right="-810"/>
+      </w:pPr>
+      <w:r>
+        <w:t xml:space="preserve">Items will be restricted at a minimum until: {{restrictionUntil}}</w:t>
+      </w:r>
+    </w:p>
+    <w:p>
+      <w:pPr>
+        <w:ind w:left="-810" w:right="-810"/>
+      </w:pPr>
+      <w:r>
+        <w:t>Items Returned:</w:t>
+      </w:r>
+      <w:r>
+        <w:tab/>
+      </w:r>
+      <w:r>
+        <w:tab/>
+      </w:r>
+      <w:r>
+        <w:tab/>
+      </w:r>
+      <w:r>
+        <w:tab/>
+      </w:r>
+      <w:r>
+        <w:tab/>
+      </w:r>
+      <w:r>
+        <w:tab/>
+      </w:r>
+      <w:r>
+        <w:tab/>
+      </w:r>
+      <w:r>
+        <w:tab/>
+        <w:t xml:space="preserve">           Date</w:t>
+      </w:r>
+      <w:r>
+        <w:tab/>
+        <w:t xml:space="preserve">      Shift OIC</w:t>
+      </w:r>
+    </w:p>
+    <w:tbl>
+      <w:tblPr>
+        <w:tblStyle w:val="TableGrid"/>
+        <w:tblW w:w="10260" w:type="dxa"/>
+        <w:tblInd w:w="-702" w:type="dxa"/>
+        <w:tblLook w:val="04A0" w:firstRow="1" w:lastRow="0" w:firstColumn="1" w:lastColumn="0" w:noHBand="0" w:noVBand="1"/>
+      </w:tblPr>
+      <w:tblGrid>
+        <w:gridCol w:w="7560"/>
+        <w:gridCol w:w="1350"/>
+        <w:gridCol w:w="1350"/>
+      </w:tblGrid>
+      <w:tr>
+        <w:tc>
+          <w:tcPr>
+            <w:tcW w:w="7560" w:type="dxa"/>
+          </w:tcPr>
+          <w:p>
+            <w:pPr>
+              <w:ind w:right="-810"/>
+            </w:pPr>
+            <w:r>
+              <w:t xml:space="preserve">{{retSignature}}</w:t>
+            </w:r>
+          </w:p>
+        </w:tc>
+        <w:tc>
+          <w:tcPr>
+            <w:tcW w:w="1350" w:type="dxa"/>
+          </w:tcPr>
+          <w:p>
+            <w:pPr>
+              <w:ind w:right="-810"/>
+            </w:pPr>
+            <w:r>
+              <w:t xml:space="preserve">{{retDate}}</w:t>
+            </w:r>
+          </w:p>
+        </w:tc>
+        <w:tc>
+          <w:tcPr>
+            <w:tcW w:w="1350" w:type="dxa"/>
+          </w:tcPr>
+          <w:p>
+            <w:pPr>
+              <w:ind w:right="-810"/>
+            </w:pPr>
+            <w:r>
+              <w:t xml:space="preserve">{{retShiftOIC}}</w:t>
+            </w:r>
+          </w:p>
+        </w:tc>
+      </w:tr>
+      <w:tr>
+        <w:tc>
+          <w:tcPr>
+            <w:tcW w:w="7560" w:type="dxa"/>
+          </w:tcPr>
+          <w:p>
+            <w:pPr>
+              <w:ind w:right="-810"/>
+            </w:pPr>
+          </w:p>
+        </w:tc>
+        <w:tc>
+          <w:tcPr>
+            <w:tcW w:w="1350" w:type="dxa"/>
+          </w:tcPr>
+          <w:p>
+            <w:pPr>
+              <w:ind w:right="-810"/>
+            </w:pPr>
+          </w:p>
+        </w:tc>
+        <w:tc>
+          <w:tcPr>
+            <w:tcW w:w="1350" w:type="dxa"/>
+          </w:tcPr>
+          <w:p>
+            <w:pPr>
+              <w:ind w:right="-810"/>
+            </w:pPr>
+          </w:p>
+        </w:tc>
+      </w:tr>
+      <w:tr>
+        <w:tc>
+          <w:tcPr>
+            <w:tcW w:w="7560" w:type="dxa"/>
+          </w:tcPr>
+          <w:p>
+            <w:pPr>
+              <w:ind w:right="-810"/>
+            </w:pPr>
+          </w:p>
+        </w:tc>
+        <w:tc>
+          <w:tcPr>
+            <w:tcW w:w="1350" w:type="dxa"/>
+          </w:tcPr>
+          <w:p>
+            <w:pPr>
+              <w:ind w:right="-810"/>
+            </w:pPr>
+          </w:p>
+        </w:tc>
+        <w:tc>
+          <w:tcPr>
+            <w:tcW w:w="1350" w:type="dxa"/>
+          </w:tcPr>
+          <w:p>
+            <w:pPr>
+              <w:ind w:right="-810"/>
+            </w:pPr>
+          </w:p>
+        </w:tc>
+      </w:tr>
+      <w:tr>
+        <w:tc>
+          <w:tcPr>
+            <w:tcW w:w="7560" w:type="dxa"/>
+          </w:tcPr>
+          <w:p>
+            <w:pPr>
+              <w:ind w:right="-810"/>
+            </w:pPr>
+          </w:p>
+        </w:tc>
+        <w:tc>
+          <w:tcPr>
+            <w:tcW w:w="1350" w:type="dxa"/>
+          </w:tcPr>
+          <w:p>
+            <w:pPr>
+              <w:ind w:right="-810"/>
+            </w:pPr>
+          </w:p>
+        </w:tc>
+        <w:tc>
+          <w:tcPr>
+            <w:tcW w:w="1350" w:type="dxa"/>
+          </w:tcPr>
+          <w:p>
+            <w:pPr>
+              <w:ind w:right="-810"/>
+            </w:pPr>
+          </w:p>
+        </w:tc>
+      </w:tr>
+    </w:tbl>
+    <w:p>
+      <w:pPr>
+        <w:ind w:left="-810" w:right="-810"/>
+        <w:jc w:val="both"/>
+      </w:pPr>
+      <w:r>
+        <w:rPr>
+          <w:sz w:val="20"/>
+          <w:szCs w:val="20"/>
+        </w:rPr>
+        <w:t>This form is to be completed</w:t>
+      </w:r>
+      <w:r>
+        <w:rPr>
+          <w:sz w:val="20"/>
+          <w:szCs w:val="20"/>
+        </w:rPr>
+        <w:t xml:space="preserve"> and attached to an incident report</w:t>
+      </w:r>
+      <w:r>
+        <w:rPr>
+          <w:sz w:val="20"/>
+          <w:szCs w:val="20"/>
+        </w:rPr>
+        <w:t xml:space="preserve"> on all inmates that are placed on property restriction for security reasons. This form does not apply to items or property restricted by Mental Health or Medical Personnel for suicide watch or Alternative Housing. All property restricted and returned must also be documented on the inmate DC6-229. Items will be returned to the inmate when no further behavior or threat of behavior occurs that led to the restriction. If the inmate behavior or threat of behavior continues after 72 hours the </w:t>
+      </w:r>
+      <w:r>
+        <w:rPr>
+          <w:b/>
+          <w:i/>
+          <w:color w:val="FF0000"/>
+          <w:sz w:val="20"/>
+          <w:szCs w:val="20"/>
+          <w:u w:val="single"/>
+        </w:rPr>
+        <w:t>Warden</w:t>
+      </w:r>
+      <w:r>
+        <w:rPr>
+          <w:sz w:val="20"/>
+          <w:szCs w:val="20"/>
+        </w:rPr>
+        <w:t xml:space="preserve"> must approve for the continuation of the property restriction, this review will be conducted within 72 hours of the restriction. </w:t>
+      </w:r>
+      <w:r>
+        <w:rPr>
+          <w:b/>
+          <w:sz w:val="20"/>
+          <w:szCs w:val="20"/>
+        </w:rPr>
+        <w:t>At no time will an inmate be left without the means to cover himself. All property being taken will be inventoried and properly stored in compliance of F.A.C. 33-602.201 Inmate Property.</w:t>
+      </w:r>
+    </w:p>
+    <w:sectPr>
+      <w:pgSz w:w="12240" w:h="15840"/>
+      <w:pgMar w:top="576" w:right="1800" w:bottom="432" w:left="1800" w:header="720" w:footer="720" w:gutter="0"/>
+      <w:cols w:space="720"/>
+      <w:docGrid w:linePitch="360"/>
+    </w:sectPr>
+  </w:body>
+</w:document>
 </file>
 
 <file path=word/styles.xml><?xml version="1.0" encoding="utf-8"?>

</xml_diff>

<commit_message>
Update property restriction form to use original document template
Restore the original Word document template for property restrictions and inject placeholders.

Replit-Commit-Author: Agent
Replit-Commit-Session-Id: 12181e52-eb76-427f-8200-e868f0fd7a8f
Replit-Commit-Checkpoint-Type: full_checkpoint
Replit-Commit-Event-Id: 34b21777-c45a-4458-bea8-5500fb981446
Replit-Commit-Screenshot-Url: https://storage.googleapis.com/screenshot-production-us-central1/d76cc230-a508-46af-99a2-c8a4a09ee388/12181e52-eb76-427f-8200-e868f0fd7a8f/pDr6G74
Replit-Helium-Checkpoint-Created: true
</commit_message>
<xml_diff>
--- a/artifacts/cdc-coach/public/property-restriction-template.docx
+++ b/artifacts/cdc-coach/public/property-restriction-template.docx
@@ -112,7 +112,7 @@
               <w:rPr>
                 <w:color w:val="000000"/>
               </w:rPr>
-              <w:t>{{L}}, {{F}}</w:t>
+              <w:t xml:space="preserve">{{L}}, {{F}}</w:t>
             </w:r>
           </w:p>
         </w:tc>
@@ -147,13 +147,7 @@
               <w:rPr>
                 <w:color w:val="000000"/>
               </w:rPr>
-              <w:t>{{DC}}</w:t>
-            </w:r>
-            <w:r>
-              <w:rPr>
-                <w:color w:val="000000"/>
-              </w:rPr>
-              <w:t xml:space="preserve"> </w:t>
+              <w:t xml:space="preserve">{{DC}}</w:t>
             </w:r>
           </w:p>
         </w:tc>
@@ -192,37 +186,7 @@
               <w:rPr>
                 <w:b/>
               </w:rPr>
-              <w:t>{{DATE}}</w:t>
-            </w:r>
-            <w:r>
-              <w:rPr>
-                <w:b/>
-              </w:rPr>
-              <w:t/>
-            </w:r>
-            <w:r>
-              <w:rPr>
-                <w:b/>
-              </w:rPr>
-              <w:t/>
-            </w:r>
-            <w:r>
-              <w:rPr>
-                <w:b/>
-              </w:rPr>
-              <w:t/>
-            </w:r>
-            <w:r>
-              <w:rPr>
-                <w:b/>
-              </w:rPr>
-              <w:t/>
-            </w:r>
-            <w:r>
-              <w:rPr>
-                <w:b/>
-              </w:rPr>
-              <w:t/>
+              <w:t xml:space="preserve">{{DATE}}</w:t>
             </w:r>
           </w:p>
         </w:tc>
@@ -255,7 +219,7 @@
               <w:rPr>
                 <w:b/>
               </w:rPr>
-              <w:t>{{SHIFT}}</w:t>
+              <w:t xml:space="preserve">{{SHIFT}}</w:t>
             </w:r>
           </w:p>
         </w:tc>
@@ -289,25 +253,7 @@
               <w:rPr>
                 <w:b/>
               </w:rPr>
-              <w:t>{{DORM}}</w:t>
-            </w:r>
-            <w:r>
-              <w:rPr>
-                <w:b/>
-              </w:rPr>
-              <w:t/>
-            </w:r>
-            <w:r>
-              <w:rPr>
-                <w:b/>
-              </w:rPr>
-              <w:t/>
-            </w:r>
-            <w:r>
-              <w:rPr>
-                <w:b/>
-              </w:rPr>
-              <w:t/>
+              <w:t xml:space="preserve">{{DORM}}</w:t>
             </w:r>
           </w:p>
         </w:tc>
@@ -421,298 +367,6 @@
                               </w:rPr>
                               <w:t xml:space="preserve">I, {{STAFF}}, was conducting a cell search/security inspection of {{LOC}} at approximately {{TIME}}. During the search/inspection, Inmate {{L}}, {{F}} DC# {{DC}} was found to be in possession of multiple torn state clothing items, cardboard, string, and/or other items that could be used for fishing, property misuse, or other security concerns. Due to the nature of the items located, property restriction was initiated to prevent injury to the inmate or others, prevent destruction or misuse of property or equipment, and/or prevent the inmate from impeding security staff from performing duties essential to unit and institutional security. Per FAC Chapter 33-602.220 and FAC Chapter 33-602.222, staff shall re-assess the need for continued restriction every 72 hours thereafter. The Warden will make the final determination regarding continued denial or return of the items. The items will be returned when no further behavior or threat of behavior of the type leading to the restriction has occurred.</w:t>
                             </w:r>
-                            <w:r>
-                              <w:rPr>
-                                <w:rFonts w:asciiTheme="minorHAnsi" w:hAnsiTheme="minorHAnsi" w:cstheme="minorHAnsi"/>
-                                <w:sz w:val="22"/>
-                                <w:szCs w:val="22"/>
-                              </w:rPr>
-                              <w:t/>
-                            </w:r>
-                            <w:r>
-                              <w:rPr>
-                                <w:rFonts w:asciiTheme="minorHAnsi" w:hAnsiTheme="minorHAnsi" w:cstheme="minorHAnsi"/>
-                                <w:sz w:val="22"/>
-                                <w:szCs w:val="22"/>
-                              </w:rPr>
-                              <w:t xml:space="preserve"/>
-                            </w:r>
-                            <w:r>
-                              <w:rPr>
-                                <w:rFonts w:asciiTheme="minorHAnsi" w:hAnsiTheme="minorHAnsi" w:cstheme="minorHAnsi"/>
-                                <w:sz w:val="22"/>
-                                <w:szCs w:val="22"/>
-                              </w:rPr>
-                              <w:t/>
-                            </w:r>
-                            <w:r>
-                              <w:rPr>
-                                <w:rFonts w:asciiTheme="minorHAnsi" w:hAnsiTheme="minorHAnsi" w:cstheme="minorHAnsi"/>
-                                <w:sz w:val="22"/>
-                                <w:szCs w:val="22"/>
-                              </w:rPr>
-                              <w:t/>
-                            </w:r>
-                            <w:r>
-                              <w:rPr>
-                                <w:rFonts w:asciiTheme="minorHAnsi" w:hAnsiTheme="minorHAnsi" w:cstheme="minorHAnsi"/>
-                                <w:sz w:val="22"/>
-                                <w:szCs w:val="22"/>
-                              </w:rPr>
-                              <w:t/>
-                            </w:r>
-                            <w:r>
-                              <w:rPr>
-                                <w:rFonts w:asciiTheme="minorHAnsi" w:hAnsiTheme="minorHAnsi" w:cstheme="minorHAnsi"/>
-                                <w:sz w:val="22"/>
-                                <w:szCs w:val="22"/>
-                              </w:rPr>
-                              <w:t xml:space="preserve"/>
-                            </w:r>
-                            <w:r>
-                              <w:rPr>
-                                <w:rFonts w:asciiTheme="minorHAnsi" w:hAnsiTheme="minorHAnsi" w:cstheme="minorHAnsi"/>
-                                <w:sz w:val="22"/>
-                                <w:szCs w:val="22"/>
-                              </w:rPr>
-                              <w:t/>
-                            </w:r>
-                            <w:r>
-                              <w:rPr>
-                                <w:rFonts w:asciiTheme="minorHAnsi" w:hAnsiTheme="minorHAnsi" w:cstheme="minorHAnsi"/>
-                                <w:sz w:val="22"/>
-                                <w:szCs w:val="22"/>
-                              </w:rPr>
-                              <w:t/>
-                            </w:r>
-                            <w:r>
-                              <w:rPr>
-                                <w:rFonts w:asciiTheme="minorHAnsi" w:hAnsiTheme="minorHAnsi" w:cstheme="minorHAnsi"/>
-                                <w:sz w:val="22"/>
-                                <w:szCs w:val="22"/>
-                              </w:rPr>
-                              <w:t/>
-                            </w:r>
-                            <w:r>
-                              <w:rPr>
-                                <w:rFonts w:asciiTheme="minorHAnsi" w:hAnsiTheme="minorHAnsi" w:cstheme="minorHAnsi"/>
-                                <w:sz w:val="22"/>
-                                <w:szCs w:val="22"/>
-                              </w:rPr>
-                              <w:t/>
-                            </w:r>
-                            <w:r>
-                              <w:rPr>
-                                <w:rFonts w:asciiTheme="minorHAnsi" w:hAnsiTheme="minorHAnsi" w:cstheme="minorHAnsi"/>
-                                <w:sz w:val="22"/>
-                                <w:szCs w:val="22"/>
-                              </w:rPr>
-                              <w:t xml:space="preserve"/>
-                            </w:r>
-                            <w:r>
-                              <w:rPr>
-                                <w:rFonts w:asciiTheme="minorHAnsi" w:hAnsiTheme="minorHAnsi" w:cstheme="minorHAnsi"/>
-                                <w:sz w:val="22"/>
-                                <w:szCs w:val="22"/>
-                              </w:rPr>
-                              <w:t/>
-                            </w:r>
-                            <w:r>
-                              <w:rPr>
-                                <w:rFonts w:asciiTheme="minorHAnsi" w:hAnsiTheme="minorHAnsi" w:cstheme="minorHAnsi"/>
-                                <w:sz w:val="22"/>
-                                <w:szCs w:val="22"/>
-                              </w:rPr>
-                              <w:t/>
-                            </w:r>
-                            <w:r>
-                              <w:rPr>
-                                <w:rFonts w:asciiTheme="minorHAnsi" w:hAnsiTheme="minorHAnsi" w:cstheme="minorHAnsi"/>
-                                <w:sz w:val="22"/>
-                                <w:szCs w:val="22"/>
-                              </w:rPr>
-                              <w:t/>
-                            </w:r>
-                            <w:r>
-                              <w:rPr>
-                                <w:rFonts w:asciiTheme="minorHAnsi" w:hAnsiTheme="minorHAnsi" w:cstheme="minorHAnsi"/>
-                                <w:sz w:val="22"/>
-                                <w:szCs w:val="22"/>
-                              </w:rPr>
-                              <w:t xml:space="preserve"/>
-                            </w:r>
-                            <w:r>
-                              <w:rPr>
-                                <w:rFonts w:asciiTheme="minorHAnsi" w:hAnsiTheme="minorHAnsi" w:cstheme="minorHAnsi"/>
-                                <w:sz w:val="22"/>
-                                <w:szCs w:val="22"/>
-                              </w:rPr>
-                              <w:t/>
-                            </w:r>
-                            <w:r>
-                              <w:rPr>
-                                <w:rFonts w:asciiTheme="minorHAnsi" w:hAnsiTheme="minorHAnsi" w:cstheme="minorHAnsi"/>
-                                <w:sz w:val="22"/>
-                                <w:szCs w:val="22"/>
-                              </w:rPr>
-                              <w:t/>
-                            </w:r>
-                            <w:r>
-                              <w:rPr>
-                                <w:color w:val="000000"/>
-                              </w:rPr>
-                              <w:t xml:space="preserve"/>
-                            </w:r>
-                            <w:r>
-                              <w:rPr>
-                                <w:color w:val="000000"/>
-                              </w:rPr>
-                              <w:t/>
-                            </w:r>
-                            <w:r>
-                              <w:rPr>
-                                <w:color w:val="000000"/>
-                              </w:rPr>
-                              <w:t/>
-                            </w:r>
-                            <w:r>
-                              <w:rPr>
-                                <w:color w:val="000000"/>
-                              </w:rPr>
-                              <w:t xml:space="preserve"/>
-                            </w:r>
-                            <w:r>
-                              <w:rPr>
-                                <w:rFonts w:asciiTheme="minorHAnsi" w:hAnsiTheme="minorHAnsi" w:cstheme="minorHAnsi"/>
-                                <w:sz w:val="22"/>
-                                <w:szCs w:val="22"/>
-                              </w:rPr>
-                              <w:t xml:space="preserve"/>
-                            </w:r>
-                            <w:r>
-                              <w:rPr>
-                                <w:color w:val="000000"/>
-                              </w:rPr>
-                              <w:t/>
-                            </w:r>
-                            <w:r>
-                              <w:rPr>
-                                <w:color w:val="000000"/>
-                              </w:rPr>
-                              <w:t xml:space="preserve"/>
-                            </w:r>
-                            <w:r>
-                              <w:rPr>
-                                <w:rFonts w:asciiTheme="minorHAnsi" w:hAnsiTheme="minorHAnsi" w:cstheme="minorHAnsi"/>
-                                <w:color w:val="000000"/>
-                              </w:rPr>
-                              <w:t/>
-                            </w:r>
-                            <w:r>
-                              <w:rPr>
-                                <w:rFonts w:asciiTheme="minorHAnsi" w:hAnsiTheme="minorHAnsi" w:cstheme="minorHAnsi"/>
-                                <w:color w:val="000000"/>
-                              </w:rPr>
-                              <w:t xml:space="preserve"/>
-                            </w:r>
-                            <w:r>
-                              <w:rPr>
-                                <w:rFonts w:asciiTheme="minorHAnsi" w:hAnsiTheme="minorHAnsi" w:cstheme="minorHAnsi"/>
-                                <w:color w:val="000000"/>
-                              </w:rPr>
-                              <w:t xml:space="preserve"/>
-                            </w:r>
-                            <w:r>
-                              <w:rPr>
-                                <w:rFonts w:asciiTheme="minorHAnsi" w:hAnsiTheme="minorHAnsi" w:cstheme="minorHAnsi"/>
-                                <w:color w:val="000000"/>
-                              </w:rPr>
-                              <w:t xml:space="preserve"/>
-                            </w:r>
-                            <w:r>
-                              <w:rPr>
-                                <w:rFonts w:asciiTheme="minorHAnsi" w:hAnsiTheme="minorHAnsi" w:cstheme="minorHAnsi"/>
-                                <w:color w:val="000000"/>
-                              </w:rPr>
-                              <w:t xml:space="preserve"/>
-                            </w:r>
-                            <w:proofErr w:type="gramStart"/>
-                            <w:r>
-                              <w:rPr>
-                                <w:rFonts w:asciiTheme="minorHAnsi" w:hAnsiTheme="minorHAnsi" w:cstheme="minorHAnsi"/>
-                                <w:color w:val="000000"/>
-                              </w:rPr>
-                              <w:t/>
-                            </w:r>
-                            <w:r>
-                              <w:rPr>
-                                <w:rFonts w:asciiTheme="minorHAnsi" w:hAnsiTheme="minorHAnsi" w:cstheme="minorHAnsi"/>
-                                <w:color w:val="000000"/>
-                              </w:rPr>
-                              <w:t xml:space="preserve"/>
-                            </w:r>
-                            <w:r>
-                              <w:rPr>
-                                <w:rFonts w:asciiTheme="minorHAnsi" w:hAnsiTheme="minorHAnsi" w:cstheme="minorHAnsi"/>
-                                <w:color w:val="000000"/>
-                              </w:rPr>
-                              <w:t xml:space="preserve"/>
-                            </w:r>
-                            <w:proofErr w:type="gramEnd"/>
-                            <w:r>
-                              <w:rPr>
-                                <w:rFonts w:asciiTheme="minorHAnsi" w:hAnsiTheme="minorHAnsi" w:cstheme="minorHAnsi"/>
-                                <w:color w:val="000000"/>
-                              </w:rPr>
-                              <w:t xml:space="preserve"/>
-                            </w:r>
-                            <w:r>
-                              <w:rPr>
-                                <w:rFonts w:asciiTheme="minorHAnsi" w:hAnsiTheme="minorHAnsi" w:cstheme="minorHAnsi"/>
-                                <w:color w:val="000000"/>
-                              </w:rPr>
-                              <w:t/>
-                            </w:r>
-                            <w:r>
-                              <w:rPr>
-                                <w:rFonts w:asciiTheme="minorHAnsi" w:hAnsiTheme="minorHAnsi" w:cstheme="minorHAnsi"/>
-                                <w:sz w:val="22"/>
-                                <w:szCs w:val="22"/>
-                              </w:rPr>
-                              <w:t xml:space="preserve"/>
-                            </w:r>
-                            <w:r>
-                              <w:rPr>
-                                <w:rFonts w:asciiTheme="minorHAnsi" w:hAnsiTheme="minorHAnsi" w:cstheme="minorHAnsi"/>
-                                <w:sz w:val="22"/>
-                                <w:szCs w:val="22"/>
-                              </w:rPr>
-                              <w:t/>
-                            </w:r>
-                            <w:r>
-                              <w:rPr>
-                                <w:rFonts w:asciiTheme="minorHAnsi" w:hAnsiTheme="minorHAnsi" w:cstheme="minorHAnsi"/>
-                                <w:sz w:val="22"/>
-                                <w:szCs w:val="22"/>
-                              </w:rPr>
-                              <w:t xml:space="preserve"/>
-                            </w:r>
-                            <w:r>
-                              <w:rPr>
-                                <w:rFonts w:asciiTheme="minorHAnsi" w:hAnsiTheme="minorHAnsi" w:cstheme="minorHAnsi"/>
-                                <w:sz w:val="22"/>
-                                <w:szCs w:val="22"/>
-                              </w:rPr>
-                              <w:t/>
-                            </w:r>
-                            <w:r>
-                              <w:rPr>
-                                <w:rFonts w:asciiTheme="minorHAnsi" w:hAnsiTheme="minorHAnsi" w:cstheme="minorHAnsi"/>
-                                <w:sz w:val="22"/>
-                                <w:szCs w:val="22"/>
-                              </w:rPr>
-                              <w:t xml:space="preserve"/>
-                            </w:r>
                           </w:p>
                           <w:p>
                             <w:pPr>
@@ -801,298 +455,6 @@
                         </w:rPr>
                         <w:t xml:space="preserve">I, {{STAFF}}, was conducting a cell search/security inspection of {{LOC}} at approximately {{TIME}}. During the search/inspection, Inmate {{L}}, {{F}} DC# {{DC}} was found to be in possession of multiple torn state clothing items, cardboard, string, and/or other items that could be used for fishing, property misuse, or other security concerns. Due to the nature of the items located, property restriction was initiated to prevent injury to the inmate or others, prevent destruction or misuse of property or equipment, and/or prevent the inmate from impeding security staff from performing duties essential to unit and institutional security. Per FAC Chapter 33-602.220 and FAC Chapter 33-602.222, staff shall re-assess the need for continued restriction every 72 hours thereafter. The Warden will make the final determination regarding continued denial or return of the items. The items will be returned when no further behavior or threat of behavior of the type leading to the restriction has occurred.</w:t>
                       </w:r>
-                      <w:r>
-                        <w:rPr>
-                          <w:rFonts w:asciiTheme="minorHAnsi" w:hAnsiTheme="minorHAnsi" w:cstheme="minorHAnsi"/>
-                          <w:sz w:val="22"/>
-                          <w:szCs w:val="22"/>
-                        </w:rPr>
-                        <w:t/>
-                      </w:r>
-                      <w:r>
-                        <w:rPr>
-                          <w:rFonts w:asciiTheme="minorHAnsi" w:hAnsiTheme="minorHAnsi" w:cstheme="minorHAnsi"/>
-                          <w:sz w:val="22"/>
-                          <w:szCs w:val="22"/>
-                        </w:rPr>
-                        <w:t xml:space="preserve"/>
-                      </w:r>
-                      <w:r>
-                        <w:rPr>
-                          <w:rFonts w:asciiTheme="minorHAnsi" w:hAnsiTheme="minorHAnsi" w:cstheme="minorHAnsi"/>
-                          <w:sz w:val="22"/>
-                          <w:szCs w:val="22"/>
-                        </w:rPr>
-                        <w:t/>
-                      </w:r>
-                      <w:r>
-                        <w:rPr>
-                          <w:rFonts w:asciiTheme="minorHAnsi" w:hAnsiTheme="minorHAnsi" w:cstheme="minorHAnsi"/>
-                          <w:sz w:val="22"/>
-                          <w:szCs w:val="22"/>
-                        </w:rPr>
-                        <w:t/>
-                      </w:r>
-                      <w:r>
-                        <w:rPr>
-                          <w:rFonts w:asciiTheme="minorHAnsi" w:hAnsiTheme="minorHAnsi" w:cstheme="minorHAnsi"/>
-                          <w:sz w:val="22"/>
-                          <w:szCs w:val="22"/>
-                        </w:rPr>
-                        <w:t/>
-                      </w:r>
-                      <w:r>
-                        <w:rPr>
-                          <w:rFonts w:asciiTheme="minorHAnsi" w:hAnsiTheme="minorHAnsi" w:cstheme="minorHAnsi"/>
-                          <w:sz w:val="22"/>
-                          <w:szCs w:val="22"/>
-                        </w:rPr>
-                        <w:t xml:space="preserve"/>
-                      </w:r>
-                      <w:r>
-                        <w:rPr>
-                          <w:rFonts w:asciiTheme="minorHAnsi" w:hAnsiTheme="minorHAnsi" w:cstheme="minorHAnsi"/>
-                          <w:sz w:val="22"/>
-                          <w:szCs w:val="22"/>
-                        </w:rPr>
-                        <w:t/>
-                      </w:r>
-                      <w:r>
-                        <w:rPr>
-                          <w:rFonts w:asciiTheme="minorHAnsi" w:hAnsiTheme="minorHAnsi" w:cstheme="minorHAnsi"/>
-                          <w:sz w:val="22"/>
-                          <w:szCs w:val="22"/>
-                        </w:rPr>
-                        <w:t/>
-                      </w:r>
-                      <w:r>
-                        <w:rPr>
-                          <w:rFonts w:asciiTheme="minorHAnsi" w:hAnsiTheme="minorHAnsi" w:cstheme="minorHAnsi"/>
-                          <w:sz w:val="22"/>
-                          <w:szCs w:val="22"/>
-                        </w:rPr>
-                        <w:t/>
-                      </w:r>
-                      <w:r>
-                        <w:rPr>
-                          <w:rFonts w:asciiTheme="minorHAnsi" w:hAnsiTheme="minorHAnsi" w:cstheme="minorHAnsi"/>
-                          <w:sz w:val="22"/>
-                          <w:szCs w:val="22"/>
-                        </w:rPr>
-                        <w:t/>
-                      </w:r>
-                      <w:r>
-                        <w:rPr>
-                          <w:rFonts w:asciiTheme="minorHAnsi" w:hAnsiTheme="minorHAnsi" w:cstheme="minorHAnsi"/>
-                          <w:sz w:val="22"/>
-                          <w:szCs w:val="22"/>
-                        </w:rPr>
-                        <w:t xml:space="preserve"/>
-                      </w:r>
-                      <w:r>
-                        <w:rPr>
-                          <w:rFonts w:asciiTheme="minorHAnsi" w:hAnsiTheme="minorHAnsi" w:cstheme="minorHAnsi"/>
-                          <w:sz w:val="22"/>
-                          <w:szCs w:val="22"/>
-                        </w:rPr>
-                        <w:t/>
-                      </w:r>
-                      <w:r>
-                        <w:rPr>
-                          <w:rFonts w:asciiTheme="minorHAnsi" w:hAnsiTheme="minorHAnsi" w:cstheme="minorHAnsi"/>
-                          <w:sz w:val="22"/>
-                          <w:szCs w:val="22"/>
-                        </w:rPr>
-                        <w:t/>
-                      </w:r>
-                      <w:r>
-                        <w:rPr>
-                          <w:rFonts w:asciiTheme="minorHAnsi" w:hAnsiTheme="minorHAnsi" w:cstheme="minorHAnsi"/>
-                          <w:sz w:val="22"/>
-                          <w:szCs w:val="22"/>
-                        </w:rPr>
-                        <w:t/>
-                      </w:r>
-                      <w:r>
-                        <w:rPr>
-                          <w:rFonts w:asciiTheme="minorHAnsi" w:hAnsiTheme="minorHAnsi" w:cstheme="minorHAnsi"/>
-                          <w:sz w:val="22"/>
-                          <w:szCs w:val="22"/>
-                        </w:rPr>
-                        <w:t xml:space="preserve"/>
-                      </w:r>
-                      <w:r>
-                        <w:rPr>
-                          <w:rFonts w:asciiTheme="minorHAnsi" w:hAnsiTheme="minorHAnsi" w:cstheme="minorHAnsi"/>
-                          <w:sz w:val="22"/>
-                          <w:szCs w:val="22"/>
-                        </w:rPr>
-                        <w:t/>
-                      </w:r>
-                      <w:r>
-                        <w:rPr>
-                          <w:rFonts w:asciiTheme="minorHAnsi" w:hAnsiTheme="minorHAnsi" w:cstheme="minorHAnsi"/>
-                          <w:sz w:val="22"/>
-                          <w:szCs w:val="22"/>
-                        </w:rPr>
-                        <w:t/>
-                      </w:r>
-                      <w:r>
-                        <w:rPr>
-                          <w:color w:val="000000"/>
-                        </w:rPr>
-                        <w:t xml:space="preserve"/>
-                      </w:r>
-                      <w:r>
-                        <w:rPr>
-                          <w:color w:val="000000"/>
-                        </w:rPr>
-                        <w:t/>
-                      </w:r>
-                      <w:r>
-                        <w:rPr>
-                          <w:color w:val="000000"/>
-                        </w:rPr>
-                        <w:t/>
-                      </w:r>
-                      <w:r>
-                        <w:rPr>
-                          <w:color w:val="000000"/>
-                        </w:rPr>
-                        <w:t xml:space="preserve"/>
-                      </w:r>
-                      <w:r>
-                        <w:rPr>
-                          <w:rFonts w:asciiTheme="minorHAnsi" w:hAnsiTheme="minorHAnsi" w:cstheme="minorHAnsi"/>
-                          <w:sz w:val="22"/>
-                          <w:szCs w:val="22"/>
-                        </w:rPr>
-                        <w:t xml:space="preserve"/>
-                      </w:r>
-                      <w:r>
-                        <w:rPr>
-                          <w:color w:val="000000"/>
-                        </w:rPr>
-                        <w:t/>
-                      </w:r>
-                      <w:r>
-                        <w:rPr>
-                          <w:color w:val="000000"/>
-                        </w:rPr>
-                        <w:t xml:space="preserve"/>
-                      </w:r>
-                      <w:r>
-                        <w:rPr>
-                          <w:rFonts w:asciiTheme="minorHAnsi" w:hAnsiTheme="minorHAnsi" w:cstheme="minorHAnsi"/>
-                          <w:color w:val="000000"/>
-                        </w:rPr>
-                        <w:t/>
-                      </w:r>
-                      <w:r>
-                        <w:rPr>
-                          <w:rFonts w:asciiTheme="minorHAnsi" w:hAnsiTheme="minorHAnsi" w:cstheme="minorHAnsi"/>
-                          <w:color w:val="000000"/>
-                        </w:rPr>
-                        <w:t xml:space="preserve"/>
-                      </w:r>
-                      <w:r>
-                        <w:rPr>
-                          <w:rFonts w:asciiTheme="minorHAnsi" w:hAnsiTheme="minorHAnsi" w:cstheme="minorHAnsi"/>
-                          <w:color w:val="000000"/>
-                        </w:rPr>
-                        <w:t xml:space="preserve"/>
-                      </w:r>
-                      <w:r>
-                        <w:rPr>
-                          <w:rFonts w:asciiTheme="minorHAnsi" w:hAnsiTheme="minorHAnsi" w:cstheme="minorHAnsi"/>
-                          <w:color w:val="000000"/>
-                        </w:rPr>
-                        <w:t xml:space="preserve"/>
-                      </w:r>
-                      <w:r>
-                        <w:rPr>
-                          <w:rFonts w:asciiTheme="minorHAnsi" w:hAnsiTheme="minorHAnsi" w:cstheme="minorHAnsi"/>
-                          <w:color w:val="000000"/>
-                        </w:rPr>
-                        <w:t xml:space="preserve"/>
-                      </w:r>
-                      <w:proofErr w:type="gramStart"/>
-                      <w:r>
-                        <w:rPr>
-                          <w:rFonts w:asciiTheme="minorHAnsi" w:hAnsiTheme="minorHAnsi" w:cstheme="minorHAnsi"/>
-                          <w:color w:val="000000"/>
-                        </w:rPr>
-                        <w:t/>
-                      </w:r>
-                      <w:r>
-                        <w:rPr>
-                          <w:rFonts w:asciiTheme="minorHAnsi" w:hAnsiTheme="minorHAnsi" w:cstheme="minorHAnsi"/>
-                          <w:color w:val="000000"/>
-                        </w:rPr>
-                        <w:t xml:space="preserve"/>
-                      </w:r>
-                      <w:r>
-                        <w:rPr>
-                          <w:rFonts w:asciiTheme="minorHAnsi" w:hAnsiTheme="minorHAnsi" w:cstheme="minorHAnsi"/>
-                          <w:color w:val="000000"/>
-                        </w:rPr>
-                        <w:t xml:space="preserve"/>
-                      </w:r>
-                      <w:proofErr w:type="gramEnd"/>
-                      <w:r>
-                        <w:rPr>
-                          <w:rFonts w:asciiTheme="minorHAnsi" w:hAnsiTheme="minorHAnsi" w:cstheme="minorHAnsi"/>
-                          <w:color w:val="000000"/>
-                        </w:rPr>
-                        <w:t xml:space="preserve"/>
-                      </w:r>
-                      <w:r>
-                        <w:rPr>
-                          <w:rFonts w:asciiTheme="minorHAnsi" w:hAnsiTheme="minorHAnsi" w:cstheme="minorHAnsi"/>
-                          <w:color w:val="000000"/>
-                        </w:rPr>
-                        <w:t/>
-                      </w:r>
-                      <w:r>
-                        <w:rPr>
-                          <w:rFonts w:asciiTheme="minorHAnsi" w:hAnsiTheme="minorHAnsi" w:cstheme="minorHAnsi"/>
-                          <w:sz w:val="22"/>
-                          <w:szCs w:val="22"/>
-                        </w:rPr>
-                        <w:t xml:space="preserve"/>
-                      </w:r>
-                      <w:r>
-                        <w:rPr>
-                          <w:rFonts w:asciiTheme="minorHAnsi" w:hAnsiTheme="minorHAnsi" w:cstheme="minorHAnsi"/>
-                          <w:sz w:val="22"/>
-                          <w:szCs w:val="22"/>
-                        </w:rPr>
-                        <w:t/>
-                      </w:r>
-                      <w:r>
-                        <w:rPr>
-                          <w:rFonts w:asciiTheme="minorHAnsi" w:hAnsiTheme="minorHAnsi" w:cstheme="minorHAnsi"/>
-                          <w:sz w:val="22"/>
-                          <w:szCs w:val="22"/>
-                        </w:rPr>
-                        <w:t xml:space="preserve"/>
-                      </w:r>
-                      <w:r>
-                        <w:rPr>
-                          <w:rFonts w:asciiTheme="minorHAnsi" w:hAnsiTheme="minorHAnsi" w:cstheme="minorHAnsi"/>
-                          <w:sz w:val="22"/>
-                          <w:szCs w:val="22"/>
-                        </w:rPr>
-                        <w:t/>
-                      </w:r>
-                      <w:r>
-                        <w:rPr>
-                          <w:rFonts w:asciiTheme="minorHAnsi" w:hAnsiTheme="minorHAnsi" w:cstheme="minorHAnsi"/>
-                          <w:sz w:val="22"/>
-                          <w:szCs w:val="22"/>
-                        </w:rPr>
-                        <w:t xml:space="preserve"/>
-                      </w:r>
                     </w:p>
                     <w:p>
                       <w:pPr>
@@ -1249,22 +611,7 @@
         </w:rPr>
       </w:pPr>
       <w:r>
-        <w:rPr>
-          <w:b/>
-        </w:rPr>
         <w:t xml:space="preserve">Restrictions: {{REST}}</w:t>
-      </w:r>
-      <w:r>
-        <w:rPr>
-          <w:b/>
-        </w:rPr>
-        <w:t/>
-      </w:r>
-      <w:r>
-        <w:rPr>
-          <w:b/>
-        </w:rPr>
-        <w:t xml:space="preserve"/>
       </w:r>
     </w:p>
     <w:tbl>
@@ -1405,7 +752,7 @@
                                     <w:rPr>
                                       <w:sz w:val="20"/>
                                     </w:rPr>
-                                    <w:t xml:space="preserve">____{{MY}}____   </w:t>
+                                    <w:t xml:space="preserve">_________   </w:t>
                                   </w:r>
                                   <w:proofErr w:type="spellStart"/>
                                   <w:r>
@@ -1599,7 +946,7 @@
                                 <w:sz w:val="20"/>
                               </w:rPr>
                               <w:tab/>
-                              <w:t xml:space="preserve">____{{MY}}____   </w:t>
+                              <w:t xml:space="preserve">Yes____{{MY}}____   </w:t>
                             </w:r>
                             <w:proofErr w:type="spellStart"/>
                             <w:r>
@@ -1761,13 +1108,7 @@
               <w:ind w:right="-810"/>
             </w:pPr>
             <w:r>
-              <w:t>{{SUP}}</w:t>
-            </w:r>
-            <w:r>
-              <w:t xml:space="preserve"/>
-            </w:r>
-            <w:r>
-              <w:t/>
+              <w:t xml:space="preserve">{{SUP}}</w:t>
             </w:r>
           </w:p>
         </w:tc>
@@ -1804,22 +1145,7 @@
               <w:ind w:right="-810"/>
             </w:pPr>
             <w:r>
-              <w:t>{{SDATE}}</w:t>
-            </w:r>
-            <w:r>
-              <w:t/>
-            </w:r>
-            <w:r>
-              <w:t/>
-            </w:r>
-            <w:r>
-              <w:t/>
-            </w:r>
-            <w:r>
-              <w:t/>
-            </w:r>
-            <w:r>
-              <w:t/>
+              <w:t xml:space="preserve">{{SDATE}}</w:t>
             </w:r>
           </w:p>
         </w:tc>
@@ -1921,10 +1247,7 @@
               <w:ind w:right="-810"/>
             </w:pPr>
             <w:r>
-              <w:t xml:space="preserve">{{CHIEF}}</w:t>
-            </w:r>
-            <w:r>
-              <w:t/>
+              <w:t>{{CHIEF}}</w:t>
             </w:r>
           </w:p>
         </w:tc>
@@ -1961,19 +1284,7 @@
               <w:ind w:right="-810"/>
             </w:pPr>
             <w:r>
-              <w:t>{{ADATE}}</w:t>
-            </w:r>
-            <w:r>
-              <w:t/>
-            </w:r>
-            <w:r>
-              <w:t/>
-            </w:r>
-            <w:r>
-              <w:t/>
-            </w:r>
-            <w:r>
-              <w:t/>
+              <w:t xml:space="preserve">{{ADATE}}</w:t>
             </w:r>
           </w:p>
         </w:tc>
@@ -2010,10 +1321,7 @@
               <w:ind w:right="-810"/>
             </w:pPr>
             <w:r>
-              <w:t xml:space="preserve">  </w:t>
-            </w:r>
-            <w:r>
-              <w:t>{{A}}</w:t>
+              <w:t xml:space="preserve">{{A}}</w:t>
             </w:r>
           </w:p>
         </w:tc>
@@ -2051,7 +1359,7 @@
               <w:ind w:right="-810"/>
             </w:pPr>
             <w:r>
-              <w:t xml:space="preserve"> {{D}}</w:t>
+              <w:t xml:space="preserve">  </w:t>
             </w:r>
           </w:p>
         </w:tc>
@@ -2180,19 +1488,7 @@
               <w:rPr>
                 <w:sz w:val="20"/>
               </w:rPr>
-              <w:t xml:space="preserve">    </w:t>
-            </w:r>
-            <w:r>
-              <w:rPr>
-                <w:sz w:val="20"/>
-              </w:rPr>
-              <w:t xml:space="preserve">  </w:t>
-            </w:r>
-            <w:r>
-              <w:rPr>
-                <w:sz w:val="20"/>
-              </w:rPr>
-              <w:t>Denied</w:t>
+              <w:t xml:space="preserve">{{D}}    Denied</w:t>
             </w:r>
           </w:p>
         </w:tc>
@@ -2273,6 +1569,12 @@
                                 <w:sz w:val="20"/>
                               </w:rPr>
                             </w:pPr>
+                            <w:r>
+                              <w:rPr>
+                                <w:sz w:val="20"/>
+                              </w:rPr>
+                              <w:t xml:space="preserve">{{COM}}</w:t>
+                            </w:r>
                           </w:p>
                           <w:p/>
                           <w:p/>
@@ -2322,6 +1624,12 @@
                           <w:sz w:val="20"/>
                         </w:rPr>
                       </w:pPr>
+                      <w:r>
+                        <w:rPr>
+                          <w:sz w:val="20"/>
+                        </w:rPr>
+                        <w:t xml:space="preserve">{{COM}}</w:t>
+                      </w:r>
                     </w:p>
                     <w:p/>
                     <w:p/>
@@ -2346,9 +1654,6 @@
           </mc:Fallback>
         </mc:AlternateContent>
       </w:r>
-      <w:r>
-        <w:t>{{COM}}</w:t>
-      </w:r>
     </w:p>
     <w:p>
       <w:pPr>
@@ -2371,25 +1676,7 @@
         <w:t xml:space="preserve"> </w:t>
       </w:r>
       <w:r>
-        <w:t>__</w:t>
-      </w:r>
-      <w:r>
-        <w:t>{{UNTIL}}</w:t>
-      </w:r>
-      <w:r>
-        <w:t/>
-      </w:r>
-      <w:r>
-        <w:t/>
-      </w:r>
-      <w:r>
-        <w:t/>
-      </w:r>
-      <w:r>
-        <w:t/>
-      </w:r>
-      <w:r>
-        <w:t>_</w:t>
+        <w:t>__{{UNTIL}}_</w:t>
       </w:r>
     </w:p>
     <w:p>
@@ -2451,7 +1738,7 @@
               <w:ind w:right="-810"/>
             </w:pPr>
             <w:r>
-              <w:t>{{RID}}</w:t>
+              <w:t xml:space="preserve">{{RID}}</w:t>
             </w:r>
           </w:p>
         </w:tc>
@@ -2464,7 +1751,7 @@
               <w:ind w:right="-810"/>
             </w:pPr>
             <w:r>
-              <w:t>{{RSHIFT}}</w:t>
+              <w:t xml:space="preserve">{{RSHIFT}}</w:t>
             </w:r>
           </w:p>
         </w:tc>
@@ -2477,7 +1764,7 @@
               <w:ind w:right="-810"/>
             </w:pPr>
             <w:r>
-              <w:t>{{ROIC}}</w:t>
+              <w:t xml:space="preserve">{{ROIC}}</w:t>
             </w:r>
           </w:p>
         </w:tc>

</xml_diff>

<commit_message>
Adjust alignment for the property restriction form's returned items
Update the property restriction Word template to correctly align the "Items Returned" section with Date, Shift, and OIC columns.

Replit-Commit-Author: Agent
Replit-Commit-Session-Id: 12181e52-eb76-427f-8200-e868f0fd7a8f
Replit-Commit-Checkpoint-Type: full_checkpoint
Replit-Commit-Event-Id: 10e097a2-0e5e-434b-9913-157bddeba8cc
Replit-Commit-Screenshot-Url: https://storage.googleapis.com/screenshot-production-us-central1/d76cc230-a508-46af-99a2-c8a4a09ee388/12181e52-eb76-427f-8200-e868f0fd7a8f/mThgS2d
Replit-Helium-Checkpoint-Created: true
</commit_message>
<xml_diff>
--- a/artifacts/cdc-coach/public/property-restriction-template.docx
+++ b/artifacts/cdc-coach/public/property-restriction-template.docx
@@ -2389,43 +2389,6 @@
         <w:t/>
       </w:r>
     </w:p>
-    <w:p>
-      <w:pPr>
-        <w:ind w:left="-810" w:right="-810"/>
-      </w:pPr>
-      <w:r>
-        <w:t>Items Returned:           Date {{RID}}      Shift {{RSHIFT}} OIC {{ROIC}}</w:t>
-      </w:r>
-      <w:r>
-        <w:tab/>
-      </w:r>
-      <w:r>
-        <w:tab/>
-      </w:r>
-      <w:r>
-        <w:tab/>
-      </w:r>
-      <w:r>
-        <w:tab/>
-      </w:r>
-      <w:r>
-        <w:tab/>
-      </w:r>
-      <w:r>
-        <w:tab/>
-      </w:r>
-      <w:r>
-        <w:tab/>
-      </w:r>
-      <w:r>
-        <w:tab/>
-        <w:t xml:space="preserve"/>
-      </w:r>
-      <w:r>
-        <w:tab/>
-        <w:t xml:space="preserve"/>
-      </w:r>
-    </w:p>
     <w:tbl>
       <w:tblPr>
         <w:tblStyle w:val="TableGrid"/>
@@ -2434,70 +2397,100 @@
         <w:tblLook w:val="04A0" w:firstRow="1" w:lastRow="0" w:firstColumn="1" w:lastColumn="0" w:noHBand="0" w:noVBand="1"/>
       </w:tblPr>
       <w:tblGrid>
-        <w:gridCol w:w="7560"/>
-        <w:gridCol w:w="1350"/>
-        <w:gridCol w:w="1350"/>
+        <w:gridCol w:w="4500"/>
+        <w:gridCol w:w="1920"/>
+        <w:gridCol w:w="1920"/>
+        <w:gridCol w:w="1920"/>
       </w:tblGrid>
       <w:tr>
         <w:tc>
           <w:tcPr>
-            <w:tcW w:w="7560" w:type="dxa"/>
-          </w:tcPr>
-          <w:p>
-            <w:pPr>
-              <w:ind w:right="-810"/>
-            </w:pPr>
-          </w:p>
-        </w:tc>
-        <w:tc>
-          <w:tcPr>
-            <w:tcW w:w="1350" w:type="dxa"/>
-          </w:tcPr>
-          <w:p>
-            <w:pPr>
-              <w:ind w:right="-810"/>
-            </w:pPr>
-          </w:p>
-        </w:tc>
-        <w:tc>
-          <w:tcPr>
-            <w:tcW w:w="1350" w:type="dxa"/>
-          </w:tcPr>
-          <w:p>
-            <w:pPr>
-              <w:ind w:right="-810"/>
-            </w:pPr>
+            <w:tcW w:w="4500" w:type="dxa"/>
+          </w:tcPr>
+          <w:p>
+            <w:r>
+              <w:t>Items Returned:</w:t>
+            </w:r>
+          </w:p>
+        </w:tc>
+        <w:tc>
+          <w:tcPr>
+            <w:tcW w:w="1920" w:type="dxa"/>
+          </w:tcPr>
+          <w:p>
+            <w:pPr>
+              <w:jc w:val="center"/>
+            </w:pPr>
+            <w:r>
+              <w:t>Date</w:t>
+            </w:r>
+          </w:p>
+        </w:tc>
+        <w:tc>
+          <w:tcPr>
+            <w:tcW w:w="1920" w:type="dxa"/>
+          </w:tcPr>
+          <w:p>
+            <w:pPr>
+              <w:jc w:val="center"/>
+            </w:pPr>
+            <w:r>
+              <w:t>Shift</w:t>
+            </w:r>
+          </w:p>
+        </w:tc>
+        <w:tc>
+          <w:tcPr>
+            <w:tcW w:w="1920" w:type="dxa"/>
+          </w:tcPr>
+          <w:p>
+            <w:pPr>
+              <w:jc w:val="center"/>
+            </w:pPr>
+            <w:r>
+              <w:t>OIC</w:t>
+            </w:r>
           </w:p>
         </w:tc>
       </w:tr>
       <w:tr>
         <w:tc>
           <w:tcPr>
-            <w:tcW w:w="7560" w:type="dxa"/>
-          </w:tcPr>
-          <w:p>
-            <w:pPr>
-              <w:ind w:right="-810"/>
-            </w:pPr>
-          </w:p>
-        </w:tc>
-        <w:tc>
-          <w:tcPr>
-            <w:tcW w:w="1350" w:type="dxa"/>
-          </w:tcPr>
-          <w:p>
-            <w:pPr>
-              <w:ind w:right="-810"/>
-            </w:pPr>
-          </w:p>
-        </w:tc>
-        <w:tc>
-          <w:tcPr>
-            <w:tcW w:w="1350" w:type="dxa"/>
-          </w:tcPr>
-          <w:p>
-            <w:pPr>
-              <w:ind w:right="-810"/>
+            <w:tcW w:w="4500" w:type="dxa"/>
+          </w:tcPr>
+          <w:p>
+            <w:pPr>
+              <w:jc w:val="center"/>
+            </w:pPr>
+          </w:p>
+        </w:tc>
+        <w:tc>
+          <w:tcPr>
+            <w:tcW w:w="1920" w:type="dxa"/>
+          </w:tcPr>
+          <w:p>
+            <w:pPr>
+              <w:jc w:val="center"/>
+            </w:pPr>
+          </w:p>
+        </w:tc>
+        <w:tc>
+          <w:tcPr>
+            <w:tcW w:w="1920" w:type="dxa"/>
+          </w:tcPr>
+          <w:p>
+            <w:pPr>
+              <w:jc w:val="center"/>
+            </w:pPr>
+          </w:p>
+        </w:tc>
+        <w:tc>
+          <w:tcPr>
+            <w:tcW w:w="1920" w:type="dxa"/>
+          </w:tcPr>
+          <w:p>
+            <w:pPr>
+              <w:jc w:val="center"/>
             </w:pPr>
           </w:p>
         </w:tc>
@@ -2505,31 +2498,41 @@
       <w:tr>
         <w:tc>
           <w:tcPr>
-            <w:tcW w:w="7560" w:type="dxa"/>
-          </w:tcPr>
-          <w:p>
-            <w:pPr>
-              <w:ind w:right="-810"/>
-            </w:pPr>
-          </w:p>
-        </w:tc>
-        <w:tc>
-          <w:tcPr>
-            <w:tcW w:w="1350" w:type="dxa"/>
-          </w:tcPr>
-          <w:p>
-            <w:pPr>
-              <w:ind w:right="-810"/>
-            </w:pPr>
-          </w:p>
-        </w:tc>
-        <w:tc>
-          <w:tcPr>
-            <w:tcW w:w="1350" w:type="dxa"/>
-          </w:tcPr>
-          <w:p>
-            <w:pPr>
-              <w:ind w:right="-810"/>
+            <w:tcW w:w="4500" w:type="dxa"/>
+          </w:tcPr>
+          <w:p>
+            <w:pPr>
+              <w:jc w:val="center"/>
+            </w:pPr>
+          </w:p>
+        </w:tc>
+        <w:tc>
+          <w:tcPr>
+            <w:tcW w:w="1920" w:type="dxa"/>
+          </w:tcPr>
+          <w:p>
+            <w:pPr>
+              <w:jc w:val="center"/>
+            </w:pPr>
+          </w:p>
+        </w:tc>
+        <w:tc>
+          <w:tcPr>
+            <w:tcW w:w="1920" w:type="dxa"/>
+          </w:tcPr>
+          <w:p>
+            <w:pPr>
+              <w:jc w:val="center"/>
+            </w:pPr>
+          </w:p>
+        </w:tc>
+        <w:tc>
+          <w:tcPr>
+            <w:tcW w:w="1920" w:type="dxa"/>
+          </w:tcPr>
+          <w:p>
+            <w:pPr>
+              <w:jc w:val="center"/>
             </w:pPr>
           </w:p>
         </w:tc>
@@ -2537,31 +2540,41 @@
       <w:tr>
         <w:tc>
           <w:tcPr>
-            <w:tcW w:w="7560" w:type="dxa"/>
-          </w:tcPr>
-          <w:p>
-            <w:pPr>
-              <w:ind w:right="-810"/>
-            </w:pPr>
-          </w:p>
-        </w:tc>
-        <w:tc>
-          <w:tcPr>
-            <w:tcW w:w="1350" w:type="dxa"/>
-          </w:tcPr>
-          <w:p>
-            <w:pPr>
-              <w:ind w:right="-810"/>
-            </w:pPr>
-          </w:p>
-        </w:tc>
-        <w:tc>
-          <w:tcPr>
-            <w:tcW w:w="1350" w:type="dxa"/>
-          </w:tcPr>
-          <w:p>
-            <w:pPr>
-              <w:ind w:right="-810"/>
+            <w:tcW w:w="4500" w:type="dxa"/>
+          </w:tcPr>
+          <w:p>
+            <w:pPr>
+              <w:jc w:val="center"/>
+            </w:pPr>
+          </w:p>
+        </w:tc>
+        <w:tc>
+          <w:tcPr>
+            <w:tcW w:w="1920" w:type="dxa"/>
+          </w:tcPr>
+          <w:p>
+            <w:pPr>
+              <w:jc w:val="center"/>
+            </w:pPr>
+          </w:p>
+        </w:tc>
+        <w:tc>
+          <w:tcPr>
+            <w:tcW w:w="1920" w:type="dxa"/>
+          </w:tcPr>
+          <w:p>
+            <w:pPr>
+              <w:jc w:val="center"/>
+            </w:pPr>
+          </w:p>
+        </w:tc>
+        <w:tc>
+          <w:tcPr>
+            <w:tcW w:w="1920" w:type="dxa"/>
+          </w:tcPr>
+          <w:p>
+            <w:pPr>
+              <w:jc w:val="center"/>
             </w:pPr>
           </w:p>
         </w:tc>

</xml_diff>

<commit_message>
Separate employee and supervisor names on the property restriction form
Update the property restriction form to correctly map employee and shift supervisor names to their respective fields in the document template and adjust the document template for the correct column layout.

Replit-Commit-Author: Agent
Replit-Commit-Session-Id: 12181e52-eb76-427f-8200-e868f0fd7a8f
Replit-Commit-Checkpoint-Type: full_checkpoint
Replit-Commit-Event-Id: 7857ea48-3a47-4e4a-8a91-c39b6e0a7517
Replit-Commit-Screenshot-Url: https://storage.googleapis.com/screenshot-production-us-central1/d76cc230-a508-46af-99a2-c8a4a09ee388/12181e52-eb76-427f-8200-e868f0fd7a8f/N39QXN6
Replit-Helium-Checkpoint-Created: true
</commit_message>
<xml_diff>
--- a/artifacts/cdc-coach/public/property-restriction-template.docx
+++ b/artifacts/cdc-coach/public/property-restriction-template.docx
@@ -2397,15 +2397,14 @@
         <w:tblLook w:val="04A0" w:firstRow="1" w:lastRow="0" w:firstColumn="1" w:lastColumn="0" w:noHBand="0" w:noVBand="1"/>
       </w:tblPr>
       <w:tblGrid>
-        <w:gridCol w:w="4500"/>
-        <w:gridCol w:w="1920"/>
-        <w:gridCol w:w="1920"/>
-        <w:gridCol w:w="1920"/>
+        <w:gridCol w:w="6000"/>
+        <w:gridCol w:w="2130"/>
+        <w:gridCol w:w="2130"/>
       </w:tblGrid>
       <w:tr>
         <w:tc>
           <w:tcPr>
-            <w:tcW w:w="4500" w:type="dxa"/>
+            <w:tcW w:w="6000" w:type="dxa"/>
           </w:tcPr>
           <w:p>
             <w:r>
@@ -2415,7 +2414,7 @@
         </w:tc>
         <w:tc>
           <w:tcPr>
-            <w:tcW w:w="1920" w:type="dxa"/>
+            <w:tcW w:w="2130" w:type="dxa"/>
           </w:tcPr>
           <w:p>
             <w:pPr>
@@ -2428,27 +2427,14 @@
         </w:tc>
         <w:tc>
           <w:tcPr>
-            <w:tcW w:w="1920" w:type="dxa"/>
+            <w:tcW w:w="2130" w:type="dxa"/>
           </w:tcPr>
           <w:p>
             <w:pPr>
               <w:jc w:val="center"/>
             </w:pPr>
             <w:r>
-              <w:t>Shift</w:t>
-            </w:r>
-          </w:p>
-        </w:tc>
-        <w:tc>
-          <w:tcPr>
-            <w:tcW w:w="1920" w:type="dxa"/>
-          </w:tcPr>
-          <w:p>
-            <w:pPr>
-              <w:jc w:val="center"/>
-            </w:pPr>
-            <w:r>
-              <w:t>OIC</w:t>
+              <w:t>Shift / OIC</w:t>
             </w:r>
           </w:p>
         </w:tc>
@@ -2456,7 +2442,7 @@
       <w:tr>
         <w:tc>
           <w:tcPr>
-            <w:tcW w:w="4500" w:type="dxa"/>
+            <w:tcW w:w="6000" w:type="dxa"/>
           </w:tcPr>
           <w:p>
             <w:pPr>
@@ -2466,7 +2452,7 @@
         </w:tc>
         <w:tc>
           <w:tcPr>
-            <w:tcW w:w="1920" w:type="dxa"/>
+            <w:tcW w:w="2130" w:type="dxa"/>
           </w:tcPr>
           <w:p>
             <w:pPr>
@@ -2476,17 +2462,7 @@
         </w:tc>
         <w:tc>
           <w:tcPr>
-            <w:tcW w:w="1920" w:type="dxa"/>
-          </w:tcPr>
-          <w:p>
-            <w:pPr>
-              <w:jc w:val="center"/>
-            </w:pPr>
-          </w:p>
-        </w:tc>
-        <w:tc>
-          <w:tcPr>
-            <w:tcW w:w="1920" w:type="dxa"/>
+            <w:tcW w:w="2130" w:type="dxa"/>
           </w:tcPr>
           <w:p>
             <w:pPr>
@@ -2498,7 +2474,7 @@
       <w:tr>
         <w:tc>
           <w:tcPr>
-            <w:tcW w:w="4500" w:type="dxa"/>
+            <w:tcW w:w="6000" w:type="dxa"/>
           </w:tcPr>
           <w:p>
             <w:pPr>
@@ -2508,7 +2484,7 @@
         </w:tc>
         <w:tc>
           <w:tcPr>
-            <w:tcW w:w="1920" w:type="dxa"/>
+            <w:tcW w:w="2130" w:type="dxa"/>
           </w:tcPr>
           <w:p>
             <w:pPr>
@@ -2518,17 +2494,7 @@
         </w:tc>
         <w:tc>
           <w:tcPr>
-            <w:tcW w:w="1920" w:type="dxa"/>
-          </w:tcPr>
-          <w:p>
-            <w:pPr>
-              <w:jc w:val="center"/>
-            </w:pPr>
-          </w:p>
-        </w:tc>
-        <w:tc>
-          <w:tcPr>
-            <w:tcW w:w="1920" w:type="dxa"/>
+            <w:tcW w:w="2130" w:type="dxa"/>
           </w:tcPr>
           <w:p>
             <w:pPr>
@@ -2540,7 +2506,7 @@
       <w:tr>
         <w:tc>
           <w:tcPr>
-            <w:tcW w:w="4500" w:type="dxa"/>
+            <w:tcW w:w="6000" w:type="dxa"/>
           </w:tcPr>
           <w:p>
             <w:pPr>
@@ -2550,7 +2516,7 @@
         </w:tc>
         <w:tc>
           <w:tcPr>
-            <w:tcW w:w="1920" w:type="dxa"/>
+            <w:tcW w:w="2130" w:type="dxa"/>
           </w:tcPr>
           <w:p>
             <w:pPr>
@@ -2560,17 +2526,7 @@
         </w:tc>
         <w:tc>
           <w:tcPr>
-            <w:tcW w:w="1920" w:type="dxa"/>
-          </w:tcPr>
-          <w:p>
-            <w:pPr>
-              <w:jc w:val="center"/>
-            </w:pPr>
-          </w:p>
-        </w:tc>
-        <w:tc>
-          <w:tcPr>
-            <w:tcW w:w="1920" w:type="dxa"/>
+            <w:tcW w:w="2130" w:type="dxa"/>
           </w:tcPr>
           <w:p>
             <w:pPr>

</xml_diff>

<commit_message>
Update property restriction form and template for independent name fields
Modify the property restriction template and form to ensure employee name, shift supervisor name, and chief/colonel name are mapped to distinct placeholders: {{EMPLOYEE_NAME}}, {{SHIFT_SUPERVISOR_NAME}}, and {{CHIEF_COLONEL_NAME}} respectively.

Replit-Commit-Author: Agent
Replit-Commit-Session-Id: 12181e52-eb76-427f-8200-e868f0fd7a8f
Replit-Commit-Checkpoint-Type: full_checkpoint
Replit-Commit-Event-Id: e58d03c7-2b7f-4250-84d9-fa68ec13d95b
Replit-Commit-Screenshot-Url: https://storage.googleapis.com/screenshot-production-us-central1/d76cc230-a508-46af-99a2-c8a4a09ee388/12181e52-eb76-427f-8200-e868f0fd7a8f/N39QXN6
Replit-Helium-Checkpoint-Created: true
</commit_message>
<xml_diff>
--- a/artifacts/cdc-coach/public/property-restriction-template.docx
+++ b/artifacts/cdc-coach/public/property-restriction-template.docx
@@ -419,7 +419,7 @@
                                 <w:sz w:val="22"/>
                                 <w:szCs w:val="22"/>
                               </w:rPr>
-                              <w:t xml:space="preserve">I, {{STAFF}}, was conducting a cell search/security inspection of {{LOC}} at approximately {{TIME}}. During the search/inspection, Inmate {{L}}, {{F}} DC# {{DC}} was found to be in possession of multiple torn state clothing items, cardboard, string, and/or other items that could be used for fishing, property misuse, or other security concerns. Per FAC Chapter 33-602.220 and FAC Chapter 33-602.222, if items of clothing, bedding, or property are removed for security-related reasons, staff shall re-assess the need for continued restriction every 72 hours thereafter. The Warden, based on this assessment, will make the final determination on the continued denial or return of the items. The items will be returned to the inmate when no further behavior or threat of behavior of the type leading to the restriction has occurred.</w:t>
+                              <w:t xml:space="preserve">I, {{EMPLOYEE_NAME}}, was conducting a cell search/security inspection of {{LOC}} at approximately {{TIME}}. During the search/inspection, Inmate {{L}}, {{F}} DC# {{DC}} was found to be in possession of multiple torn state clothing items, cardboard, string, and/or other items that could be used for fishing, property misuse, or other security concerns. Per FAC Chapter 33-602.220 and FAC Chapter 33-602.222, if items of clothing, bedding, or property are removed for security-related reasons, staff shall re-assess the need for continued restriction every 72 hours thereafter. The Warden, based on this assessment, will make the final determination on the continued denial or return of the items. The items will be returned to the inmate when no further behavior or threat of behavior of the type leading to the restriction has occurred.</w:t>
                             </w:r>
                             <w:r>
                               <w:rPr>
@@ -1761,7 +1761,7 @@
               <w:ind w:right="-810"/>
             </w:pPr>
             <w:r>
-              <w:t>{{SUP}}</w:t>
+              <w:t>{{SHIFT_SUPERVISOR_NAME}}</w:t>
             </w:r>
             <w:r>
               <w:t xml:space="preserve"/>
@@ -1921,7 +1921,7 @@
               <w:ind w:right="-810"/>
             </w:pPr>
             <w:r>
-              <w:t xml:space="preserve">{{CHIEF}}</w:t>
+              <w:t xml:space="preserve">{{CHIEF_COLONEL_NAME}}</w:t>
             </w:r>
             <w:r>
               <w:t/>

</xml_diff>